<commit_message>
docs: regenerate Objective1 walkthrough with final DTA results
All 10 DTA seeds complete. Updated Section 6.6 with full Davis/KIBA
seed tables and H-GNN vs ConcatBaseline statistical comparison table.
Completed items checklist updated; gaps list trimmed (MAE and DTA
concat baseline gaps now done); recommendations renumbered 1-6.

Co-Authored-By: Claude Sonnet 4.6 <noreply@anthropic.com>
</commit_message>
<xml_diff>
--- a/paper/Objective1_Full_Walkthrough.docx
+++ b/paper/Objective1_Full_Walkthrough.docx
@@ -42,7 +42,7 @@
         <w:br/>
         <w:t>Supervisor: Assoc. Prof. Dr. Nurul Hashimah</w:t>
         <w:br/>
-        <w:t>Prepared: June 2026</w:t>
+        <w:t>Prepared: July 2026</w:t>
       </w:r>
     </w:p>
     <w:p>
@@ -5345,19 +5345,7 @@
           <w:color w:val="595959"/>
           <w:sz w:val="22"/>
         </w:rPr>
-        <w:t>The same model architecture was tested on binding affinity regression (DTA) by replacing the binary classification head with a scalar regression head and switching the loss from Focal Loss to MSE.</w:t>
-      </w:r>
-    </w:p>
-    <w:p>
-      <w:pPr>
-        <w:spacing w:before="40" w:after="80"/>
-      </w:pPr>
-      <w:r>
-        <w:rPr>
-          <w:color w:val="595959"/>
-          <w:sz w:val="22"/>
-        </w:rPr>
-        <w:t>Experiments are currently running for the final seeds (5 seeds total). Partial results from completed seeds are shown below.</w:t>
+        <w:t>The same model architecture was tested on binding affinity regression (DTA) by replacing the binary classification head with a scalar regression head and switching the loss from Focal Loss to MSE. Both H-GNN-RNN-DTI and the ConcatBaseline were run for 5 seeds on each dataset, with paired t-tests to determine whether cross-attention also helps in the regression setting.</w:t>
       </w:r>
     </w:p>
     <w:p>
@@ -5370,7 +5358,1579 @@
           <w:color w:val="1F497D"/>
           <w:sz w:val="22"/>
         </w:rPr>
-        <w:t>Davis — Partial Results (Seeds 1–4 complete)</w:t>
+        <w:t>H-GNN-RNN-DTI — Davis (All 5 Seeds)</w:t>
+      </w:r>
+    </w:p>
+    <w:tbl>
+      <w:tblPr>
+        <w:tblStyle w:val="TableGrid"/>
+        <w:tblW w:type="auto" w:w="0"/>
+        <w:tblLook w:firstColumn="1" w:firstRow="1" w:lastColumn="0" w:lastRow="0" w:noHBand="0" w:noVBand="1" w:val="04A0"/>
+      </w:tblPr>
+      <w:tblGrid>
+        <w:gridCol w:w="1303"/>
+        <w:gridCol w:w="1303"/>
+        <w:gridCol w:w="1303"/>
+        <w:gridCol w:w="1303"/>
+        <w:gridCol w:w="1303"/>
+        <w:gridCol w:w="1303"/>
+        <w:gridCol w:w="1303"/>
+      </w:tblGrid>
+      <w:tr>
+        <w:tc>
+          <w:tcPr>
+            <w:tcW w:type="dxa" w:w="1296"/>
+            <w:shd w:val="clear" w:color="auto" w:fill="1F497D"/>
+          </w:tcPr>
+          <w:p>
+            <w:r>
+              <w:rPr>
+                <w:b/>
+                <w:color w:val="FFFFFF"/>
+                <w:sz w:val="20"/>
+              </w:rPr>
+              <w:t>Seed</w:t>
+            </w:r>
+          </w:p>
+        </w:tc>
+        <w:tc>
+          <w:tcPr>
+            <w:tcW w:type="dxa" w:w="1152"/>
+            <w:shd w:val="clear" w:color="auto" w:fill="1F497D"/>
+          </w:tcPr>
+          <w:p>
+            <w:r>
+              <w:rPr>
+                <w:b/>
+                <w:color w:val="FFFFFF"/>
+                <w:sz w:val="20"/>
+              </w:rPr>
+              <w:t>MSE</w:t>
+            </w:r>
+          </w:p>
+        </w:tc>
+        <w:tc>
+          <w:tcPr>
+            <w:tcW w:type="dxa" w:w="1152"/>
+            <w:shd w:val="clear" w:color="auto" w:fill="1F497D"/>
+          </w:tcPr>
+          <w:p>
+            <w:r>
+              <w:rPr>
+                <w:b/>
+                <w:color w:val="FFFFFF"/>
+                <w:sz w:val="20"/>
+              </w:rPr>
+              <w:t>MAE</w:t>
+            </w:r>
+          </w:p>
+        </w:tc>
+        <w:tc>
+          <w:tcPr>
+            <w:tcW w:type="dxa" w:w="1152"/>
+            <w:shd w:val="clear" w:color="auto" w:fill="1F497D"/>
+          </w:tcPr>
+          <w:p>
+            <w:r>
+              <w:rPr>
+                <w:b/>
+                <w:color w:val="FFFFFF"/>
+                <w:sz w:val="20"/>
+              </w:rPr>
+              <w:t>RMSE</w:t>
+            </w:r>
+          </w:p>
+        </w:tc>
+        <w:tc>
+          <w:tcPr>
+            <w:tcW w:type="dxa" w:w="1152"/>
+            <w:shd w:val="clear" w:color="auto" w:fill="1F497D"/>
+          </w:tcPr>
+          <w:p>
+            <w:r>
+              <w:rPr>
+                <w:b/>
+                <w:color w:val="FFFFFF"/>
+                <w:sz w:val="20"/>
+              </w:rPr>
+              <w:t>R²</w:t>
+            </w:r>
+          </w:p>
+        </w:tc>
+        <w:tc>
+          <w:tcPr>
+            <w:tcW w:type="dxa" w:w="1296"/>
+            <w:shd w:val="clear" w:color="auto" w:fill="1F497D"/>
+          </w:tcPr>
+          <w:p>
+            <w:r>
+              <w:rPr>
+                <w:b/>
+                <w:color w:val="FFFFFF"/>
+                <w:sz w:val="20"/>
+              </w:rPr>
+              <w:t>Pearson r</w:t>
+            </w:r>
+          </w:p>
+        </w:tc>
+        <w:tc>
+          <w:tcPr>
+            <w:tcW w:type="dxa" w:w="1296"/>
+            <w:shd w:val="clear" w:color="auto" w:fill="1F497D"/>
+          </w:tcPr>
+          <w:p>
+            <w:r>
+              <w:rPr>
+                <w:b/>
+                <w:color w:val="FFFFFF"/>
+                <w:sz w:val="20"/>
+              </w:rPr>
+              <w:t>Spearman ρ</w:t>
+            </w:r>
+          </w:p>
+        </w:tc>
+      </w:tr>
+      <w:tr>
+        <w:tc>
+          <w:tcPr>
+            <w:tcW w:type="dxa" w:w="1296"/>
+            <w:shd w:val="clear" w:color="auto" w:fill="F2F7FF"/>
+          </w:tcPr>
+          <w:p>
+            <w:r>
+              <w:rPr>
+                <w:color w:val="595959"/>
+                <w:sz w:val="20"/>
+              </w:rPr>
+              <w:t>1</w:t>
+            </w:r>
+          </w:p>
+        </w:tc>
+        <w:tc>
+          <w:tcPr>
+            <w:tcW w:type="dxa" w:w="1152"/>
+            <w:shd w:val="clear" w:color="auto" w:fill="F2F7FF"/>
+          </w:tcPr>
+          <w:p>
+            <w:r>
+              <w:rPr>
+                <w:color w:val="595959"/>
+                <w:sz w:val="20"/>
+              </w:rPr>
+              <w:t>0.3778</w:t>
+            </w:r>
+          </w:p>
+        </w:tc>
+        <w:tc>
+          <w:tcPr>
+            <w:tcW w:type="dxa" w:w="1152"/>
+            <w:shd w:val="clear" w:color="auto" w:fill="F2F7FF"/>
+          </w:tcPr>
+          <w:p>
+            <w:r>
+              <w:rPr>
+                <w:color w:val="595959"/>
+                <w:sz w:val="20"/>
+              </w:rPr>
+              <w:t>0.4183</w:t>
+            </w:r>
+          </w:p>
+        </w:tc>
+        <w:tc>
+          <w:tcPr>
+            <w:tcW w:type="dxa" w:w="1152"/>
+            <w:shd w:val="clear" w:color="auto" w:fill="F2F7FF"/>
+          </w:tcPr>
+          <w:p>
+            <w:r>
+              <w:rPr>
+                <w:color w:val="595959"/>
+                <w:sz w:val="20"/>
+              </w:rPr>
+              <w:t>0.6146</w:t>
+            </w:r>
+          </w:p>
+        </w:tc>
+        <w:tc>
+          <w:tcPr>
+            <w:tcW w:type="dxa" w:w="1152"/>
+            <w:shd w:val="clear" w:color="auto" w:fill="F2F7FF"/>
+          </w:tcPr>
+          <w:p>
+            <w:r>
+              <w:rPr>
+                <w:color w:val="595959"/>
+                <w:sz w:val="20"/>
+              </w:rPr>
+              <w:t>0.5091</w:t>
+            </w:r>
+          </w:p>
+        </w:tc>
+        <w:tc>
+          <w:tcPr>
+            <w:tcW w:type="dxa" w:w="1296"/>
+            <w:shd w:val="clear" w:color="auto" w:fill="F2F7FF"/>
+          </w:tcPr>
+          <w:p>
+            <w:r>
+              <w:rPr>
+                <w:color w:val="595959"/>
+                <w:sz w:val="20"/>
+              </w:rPr>
+              <w:t>0.7230</w:t>
+            </w:r>
+          </w:p>
+        </w:tc>
+        <w:tc>
+          <w:tcPr>
+            <w:tcW w:type="dxa" w:w="1296"/>
+            <w:shd w:val="clear" w:color="auto" w:fill="F2F7FF"/>
+          </w:tcPr>
+          <w:p>
+            <w:r>
+              <w:rPr>
+                <w:color w:val="595959"/>
+                <w:sz w:val="20"/>
+              </w:rPr>
+              <w:t>0.6070</w:t>
+            </w:r>
+          </w:p>
+        </w:tc>
+      </w:tr>
+      <w:tr>
+        <w:tc>
+          <w:tcPr>
+            <w:tcW w:type="dxa" w:w="1296"/>
+            <w:shd w:val="clear" w:color="auto" w:fill="FFFFFF"/>
+          </w:tcPr>
+          <w:p>
+            <w:r>
+              <w:rPr>
+                <w:color w:val="595959"/>
+                <w:sz w:val="20"/>
+              </w:rPr>
+              <w:t>2</w:t>
+            </w:r>
+          </w:p>
+        </w:tc>
+        <w:tc>
+          <w:tcPr>
+            <w:tcW w:type="dxa" w:w="1152"/>
+            <w:shd w:val="clear" w:color="auto" w:fill="FFFFFF"/>
+          </w:tcPr>
+          <w:p>
+            <w:r>
+              <w:rPr>
+                <w:color w:val="595959"/>
+                <w:sz w:val="20"/>
+              </w:rPr>
+              <w:t>0.3833</w:t>
+            </w:r>
+          </w:p>
+        </w:tc>
+        <w:tc>
+          <w:tcPr>
+            <w:tcW w:type="dxa" w:w="1152"/>
+            <w:shd w:val="clear" w:color="auto" w:fill="FFFFFF"/>
+          </w:tcPr>
+          <w:p>
+            <w:r>
+              <w:rPr>
+                <w:color w:val="595959"/>
+                <w:sz w:val="20"/>
+              </w:rPr>
+              <w:t>0.4230</w:t>
+            </w:r>
+          </w:p>
+        </w:tc>
+        <w:tc>
+          <w:tcPr>
+            <w:tcW w:type="dxa" w:w="1152"/>
+            <w:shd w:val="clear" w:color="auto" w:fill="FFFFFF"/>
+          </w:tcPr>
+          <w:p>
+            <w:r>
+              <w:rPr>
+                <w:color w:val="595959"/>
+                <w:sz w:val="20"/>
+              </w:rPr>
+              <w:t>0.6191</w:t>
+            </w:r>
+          </w:p>
+        </w:tc>
+        <w:tc>
+          <w:tcPr>
+            <w:tcW w:type="dxa" w:w="1152"/>
+            <w:shd w:val="clear" w:color="auto" w:fill="FFFFFF"/>
+          </w:tcPr>
+          <w:p>
+            <w:r>
+              <w:rPr>
+                <w:color w:val="595959"/>
+                <w:sz w:val="20"/>
+              </w:rPr>
+              <w:t>0.5018</w:t>
+            </w:r>
+          </w:p>
+        </w:tc>
+        <w:tc>
+          <w:tcPr>
+            <w:tcW w:type="dxa" w:w="1296"/>
+            <w:shd w:val="clear" w:color="auto" w:fill="FFFFFF"/>
+          </w:tcPr>
+          <w:p>
+            <w:r>
+              <w:rPr>
+                <w:color w:val="595959"/>
+                <w:sz w:val="20"/>
+              </w:rPr>
+              <w:t>0.7186</w:t>
+            </w:r>
+          </w:p>
+        </w:tc>
+        <w:tc>
+          <w:tcPr>
+            <w:tcW w:type="dxa" w:w="1296"/>
+            <w:shd w:val="clear" w:color="auto" w:fill="FFFFFF"/>
+          </w:tcPr>
+          <w:p>
+            <w:r>
+              <w:rPr>
+                <w:color w:val="595959"/>
+                <w:sz w:val="20"/>
+              </w:rPr>
+              <w:t>0.6059</w:t>
+            </w:r>
+          </w:p>
+        </w:tc>
+      </w:tr>
+      <w:tr>
+        <w:tc>
+          <w:tcPr>
+            <w:tcW w:type="dxa" w:w="1296"/>
+            <w:shd w:val="clear" w:color="auto" w:fill="F2F7FF"/>
+          </w:tcPr>
+          <w:p>
+            <w:r>
+              <w:rPr>
+                <w:color w:val="595959"/>
+                <w:sz w:val="20"/>
+              </w:rPr>
+              <w:t>3</w:t>
+            </w:r>
+          </w:p>
+        </w:tc>
+        <w:tc>
+          <w:tcPr>
+            <w:tcW w:type="dxa" w:w="1152"/>
+            <w:shd w:val="clear" w:color="auto" w:fill="F2F7FF"/>
+          </w:tcPr>
+          <w:p>
+            <w:r>
+              <w:rPr>
+                <w:color w:val="595959"/>
+                <w:sz w:val="20"/>
+              </w:rPr>
+              <w:t>0.3761</w:t>
+            </w:r>
+          </w:p>
+        </w:tc>
+        <w:tc>
+          <w:tcPr>
+            <w:tcW w:type="dxa" w:w="1152"/>
+            <w:shd w:val="clear" w:color="auto" w:fill="F2F7FF"/>
+          </w:tcPr>
+          <w:p>
+            <w:r>
+              <w:rPr>
+                <w:color w:val="595959"/>
+                <w:sz w:val="20"/>
+              </w:rPr>
+              <w:t>0.4136</w:t>
+            </w:r>
+          </w:p>
+        </w:tc>
+        <w:tc>
+          <w:tcPr>
+            <w:tcW w:type="dxa" w:w="1152"/>
+            <w:shd w:val="clear" w:color="auto" w:fill="F2F7FF"/>
+          </w:tcPr>
+          <w:p>
+            <w:r>
+              <w:rPr>
+                <w:color w:val="595959"/>
+                <w:sz w:val="20"/>
+              </w:rPr>
+              <w:t>0.6133</w:t>
+            </w:r>
+          </w:p>
+        </w:tc>
+        <w:tc>
+          <w:tcPr>
+            <w:tcW w:type="dxa" w:w="1152"/>
+            <w:shd w:val="clear" w:color="auto" w:fill="F2F7FF"/>
+          </w:tcPr>
+          <w:p>
+            <w:r>
+              <w:rPr>
+                <w:color w:val="595959"/>
+                <w:sz w:val="20"/>
+              </w:rPr>
+              <w:t>0.5112</w:t>
+            </w:r>
+          </w:p>
+        </w:tc>
+        <w:tc>
+          <w:tcPr>
+            <w:tcW w:type="dxa" w:w="1296"/>
+            <w:shd w:val="clear" w:color="auto" w:fill="F2F7FF"/>
+          </w:tcPr>
+          <w:p>
+            <w:r>
+              <w:rPr>
+                <w:color w:val="595959"/>
+                <w:sz w:val="20"/>
+              </w:rPr>
+              <w:t>0.7241</w:t>
+            </w:r>
+          </w:p>
+        </w:tc>
+        <w:tc>
+          <w:tcPr>
+            <w:tcW w:type="dxa" w:w="1296"/>
+            <w:shd w:val="clear" w:color="auto" w:fill="F2F7FF"/>
+          </w:tcPr>
+          <w:p>
+            <w:r>
+              <w:rPr>
+                <w:color w:val="595959"/>
+                <w:sz w:val="20"/>
+              </w:rPr>
+              <w:t>0.6161</w:t>
+            </w:r>
+          </w:p>
+        </w:tc>
+      </w:tr>
+      <w:tr>
+        <w:tc>
+          <w:tcPr>
+            <w:tcW w:type="dxa" w:w="1296"/>
+            <w:shd w:val="clear" w:color="auto" w:fill="FFFFFF"/>
+          </w:tcPr>
+          <w:p>
+            <w:r>
+              <w:rPr>
+                <w:color w:val="595959"/>
+                <w:sz w:val="20"/>
+              </w:rPr>
+              <w:t>4</w:t>
+            </w:r>
+          </w:p>
+        </w:tc>
+        <w:tc>
+          <w:tcPr>
+            <w:tcW w:type="dxa" w:w="1152"/>
+            <w:shd w:val="clear" w:color="auto" w:fill="FFFFFF"/>
+          </w:tcPr>
+          <w:p>
+            <w:r>
+              <w:rPr>
+                <w:color w:val="595959"/>
+                <w:sz w:val="20"/>
+              </w:rPr>
+              <w:t>0.3934</w:t>
+            </w:r>
+          </w:p>
+        </w:tc>
+        <w:tc>
+          <w:tcPr>
+            <w:tcW w:type="dxa" w:w="1152"/>
+            <w:shd w:val="clear" w:color="auto" w:fill="FFFFFF"/>
+          </w:tcPr>
+          <w:p>
+            <w:r>
+              <w:rPr>
+                <w:color w:val="595959"/>
+                <w:sz w:val="20"/>
+              </w:rPr>
+              <w:t>0.4195</w:t>
+            </w:r>
+          </w:p>
+        </w:tc>
+        <w:tc>
+          <w:tcPr>
+            <w:tcW w:type="dxa" w:w="1152"/>
+            <w:shd w:val="clear" w:color="auto" w:fill="FFFFFF"/>
+          </w:tcPr>
+          <w:p>
+            <w:r>
+              <w:rPr>
+                <w:color w:val="595959"/>
+                <w:sz w:val="20"/>
+              </w:rPr>
+              <w:t>0.6272</w:t>
+            </w:r>
+          </w:p>
+        </w:tc>
+        <w:tc>
+          <w:tcPr>
+            <w:tcW w:type="dxa" w:w="1152"/>
+            <w:shd w:val="clear" w:color="auto" w:fill="FFFFFF"/>
+          </w:tcPr>
+          <w:p>
+            <w:r>
+              <w:rPr>
+                <w:color w:val="595959"/>
+                <w:sz w:val="20"/>
+              </w:rPr>
+              <w:t>0.4888</w:t>
+            </w:r>
+          </w:p>
+        </w:tc>
+        <w:tc>
+          <w:tcPr>
+            <w:tcW w:type="dxa" w:w="1296"/>
+            <w:shd w:val="clear" w:color="auto" w:fill="FFFFFF"/>
+          </w:tcPr>
+          <w:p>
+            <w:r>
+              <w:rPr>
+                <w:color w:val="595959"/>
+                <w:sz w:val="20"/>
+              </w:rPr>
+              <w:t>0.7017</w:t>
+            </w:r>
+          </w:p>
+        </w:tc>
+        <w:tc>
+          <w:tcPr>
+            <w:tcW w:type="dxa" w:w="1296"/>
+            <w:shd w:val="clear" w:color="auto" w:fill="FFFFFF"/>
+          </w:tcPr>
+          <w:p>
+            <w:r>
+              <w:rPr>
+                <w:color w:val="595959"/>
+                <w:sz w:val="20"/>
+              </w:rPr>
+              <w:t>0.5944</w:t>
+            </w:r>
+          </w:p>
+        </w:tc>
+      </w:tr>
+      <w:tr>
+        <w:tc>
+          <w:tcPr>
+            <w:tcW w:type="dxa" w:w="1296"/>
+            <w:shd w:val="clear" w:color="auto" w:fill="F2F7FF"/>
+          </w:tcPr>
+          <w:p>
+            <w:r>
+              <w:rPr>
+                <w:color w:val="595959"/>
+                <w:sz w:val="20"/>
+              </w:rPr>
+              <w:t>5</w:t>
+            </w:r>
+          </w:p>
+        </w:tc>
+        <w:tc>
+          <w:tcPr>
+            <w:tcW w:type="dxa" w:w="1152"/>
+            <w:shd w:val="clear" w:color="auto" w:fill="F2F7FF"/>
+          </w:tcPr>
+          <w:p>
+            <w:r>
+              <w:rPr>
+                <w:color w:val="595959"/>
+                <w:sz w:val="20"/>
+              </w:rPr>
+              <w:t>0.3634</w:t>
+            </w:r>
+          </w:p>
+        </w:tc>
+        <w:tc>
+          <w:tcPr>
+            <w:tcW w:type="dxa" w:w="1152"/>
+            <w:shd w:val="clear" w:color="auto" w:fill="F2F7FF"/>
+          </w:tcPr>
+          <w:p>
+            <w:r>
+              <w:rPr>
+                <w:color w:val="595959"/>
+                <w:sz w:val="20"/>
+              </w:rPr>
+              <w:t>0.4017</w:t>
+            </w:r>
+          </w:p>
+        </w:tc>
+        <w:tc>
+          <w:tcPr>
+            <w:tcW w:type="dxa" w:w="1152"/>
+            <w:shd w:val="clear" w:color="auto" w:fill="F2F7FF"/>
+          </w:tcPr>
+          <w:p>
+            <w:r>
+              <w:rPr>
+                <w:color w:val="595959"/>
+                <w:sz w:val="20"/>
+              </w:rPr>
+              <w:t>0.6028</w:t>
+            </w:r>
+          </w:p>
+        </w:tc>
+        <w:tc>
+          <w:tcPr>
+            <w:tcW w:type="dxa" w:w="1152"/>
+            <w:shd w:val="clear" w:color="auto" w:fill="F2F7FF"/>
+          </w:tcPr>
+          <w:p>
+            <w:r>
+              <w:rPr>
+                <w:color w:val="595959"/>
+                <w:sz w:val="20"/>
+              </w:rPr>
+              <w:t>0.5277</w:t>
+            </w:r>
+          </w:p>
+        </w:tc>
+        <w:tc>
+          <w:tcPr>
+            <w:tcW w:type="dxa" w:w="1296"/>
+            <w:shd w:val="clear" w:color="auto" w:fill="F2F7FF"/>
+          </w:tcPr>
+          <w:p>
+            <w:r>
+              <w:rPr>
+                <w:color w:val="595959"/>
+                <w:sz w:val="20"/>
+              </w:rPr>
+              <w:t>0.7384</w:t>
+            </w:r>
+          </w:p>
+        </w:tc>
+        <w:tc>
+          <w:tcPr>
+            <w:tcW w:type="dxa" w:w="1296"/>
+            <w:shd w:val="clear" w:color="auto" w:fill="F2F7FF"/>
+          </w:tcPr>
+          <w:p>
+            <w:r>
+              <w:rPr>
+                <w:color w:val="595959"/>
+                <w:sz w:val="20"/>
+              </w:rPr>
+              <w:t>0.6248</w:t>
+            </w:r>
+          </w:p>
+        </w:tc>
+      </w:tr>
+      <w:tr>
+        <w:tc>
+          <w:tcPr>
+            <w:tcW w:type="dxa" w:w="1296"/>
+            <w:shd w:val="clear" w:color="auto" w:fill="FFFFFF"/>
+          </w:tcPr>
+          <w:p>
+            <w:r>
+              <w:rPr>
+                <w:color w:val="595959"/>
+                <w:sz w:val="20"/>
+              </w:rPr>
+              <w:t>Mean ± std</w:t>
+            </w:r>
+          </w:p>
+        </w:tc>
+        <w:tc>
+          <w:tcPr>
+            <w:tcW w:type="dxa" w:w="1152"/>
+            <w:shd w:val="clear" w:color="auto" w:fill="FFFFFF"/>
+          </w:tcPr>
+          <w:p>
+            <w:r>
+              <w:rPr>
+                <w:color w:val="595959"/>
+                <w:sz w:val="20"/>
+              </w:rPr>
+              <w:t>0.379 ± 0.011</w:t>
+            </w:r>
+          </w:p>
+        </w:tc>
+        <w:tc>
+          <w:tcPr>
+            <w:tcW w:type="dxa" w:w="1152"/>
+            <w:shd w:val="clear" w:color="auto" w:fill="FFFFFF"/>
+          </w:tcPr>
+          <w:p>
+            <w:r>
+              <w:rPr>
+                <w:color w:val="595959"/>
+                <w:sz w:val="20"/>
+              </w:rPr>
+              <w:t>0.415 ± 0.008</w:t>
+            </w:r>
+          </w:p>
+        </w:tc>
+        <w:tc>
+          <w:tcPr>
+            <w:tcW w:type="dxa" w:w="1152"/>
+            <w:shd w:val="clear" w:color="auto" w:fill="FFFFFF"/>
+          </w:tcPr>
+          <w:p>
+            <w:r>
+              <w:rPr>
+                <w:color w:val="595959"/>
+                <w:sz w:val="20"/>
+              </w:rPr>
+              <w:t>0.615 ± 0.009</w:t>
+            </w:r>
+          </w:p>
+        </w:tc>
+        <w:tc>
+          <w:tcPr>
+            <w:tcW w:type="dxa" w:w="1152"/>
+            <w:shd w:val="clear" w:color="auto" w:fill="FFFFFF"/>
+          </w:tcPr>
+          <w:p>
+            <w:r>
+              <w:rPr>
+                <w:color w:val="595959"/>
+                <w:sz w:val="20"/>
+              </w:rPr>
+              <w:t>0.508 ± 0.014</w:t>
+            </w:r>
+          </w:p>
+        </w:tc>
+        <w:tc>
+          <w:tcPr>
+            <w:tcW w:type="dxa" w:w="1296"/>
+            <w:shd w:val="clear" w:color="auto" w:fill="FFFFFF"/>
+          </w:tcPr>
+          <w:p>
+            <w:r>
+              <w:rPr>
+                <w:color w:val="595959"/>
+                <w:sz w:val="20"/>
+              </w:rPr>
+              <w:t>0.721 ± 0.013</w:t>
+            </w:r>
+          </w:p>
+        </w:tc>
+        <w:tc>
+          <w:tcPr>
+            <w:tcW w:type="dxa" w:w="1296"/>
+            <w:shd w:val="clear" w:color="auto" w:fill="FFFFFF"/>
+          </w:tcPr>
+          <w:p>
+            <w:r>
+              <w:rPr>
+                <w:color w:val="595959"/>
+                <w:sz w:val="20"/>
+              </w:rPr>
+              <w:t>0.610 ± 0.011</w:t>
+            </w:r>
+          </w:p>
+        </w:tc>
+      </w:tr>
+    </w:tbl>
+    <w:p/>
+    <w:p>
+      <w:pPr>
+        <w:spacing w:before="160" w:after="40"/>
+      </w:pPr>
+      <w:r>
+        <w:rPr>
+          <w:b/>
+          <w:color w:val="1F497D"/>
+          <w:sz w:val="22"/>
+        </w:rPr>
+        <w:t>H-GNN-RNN-DTI — KIBA (All 5 Seeds)</w:t>
+      </w:r>
+    </w:p>
+    <w:tbl>
+      <w:tblPr>
+        <w:tblStyle w:val="TableGrid"/>
+        <w:tblW w:type="auto" w:w="0"/>
+        <w:tblLook w:firstColumn="1" w:firstRow="1" w:lastColumn="0" w:lastRow="0" w:noHBand="0" w:noVBand="1" w:val="04A0"/>
+      </w:tblPr>
+      <w:tblGrid>
+        <w:gridCol w:w="1303"/>
+        <w:gridCol w:w="1303"/>
+        <w:gridCol w:w="1303"/>
+        <w:gridCol w:w="1303"/>
+        <w:gridCol w:w="1303"/>
+        <w:gridCol w:w="1303"/>
+        <w:gridCol w:w="1303"/>
+      </w:tblGrid>
+      <w:tr>
+        <w:tc>
+          <w:tcPr>
+            <w:tcW w:type="dxa" w:w="1296"/>
+            <w:shd w:val="clear" w:color="auto" w:fill="1F497D"/>
+          </w:tcPr>
+          <w:p>
+            <w:r>
+              <w:rPr>
+                <w:b/>
+                <w:color w:val="FFFFFF"/>
+                <w:sz w:val="20"/>
+              </w:rPr>
+              <w:t>Seed</w:t>
+            </w:r>
+          </w:p>
+        </w:tc>
+        <w:tc>
+          <w:tcPr>
+            <w:tcW w:type="dxa" w:w="1152"/>
+            <w:shd w:val="clear" w:color="auto" w:fill="1F497D"/>
+          </w:tcPr>
+          <w:p>
+            <w:r>
+              <w:rPr>
+                <w:b/>
+                <w:color w:val="FFFFFF"/>
+                <w:sz w:val="20"/>
+              </w:rPr>
+              <w:t>MSE</w:t>
+            </w:r>
+          </w:p>
+        </w:tc>
+        <w:tc>
+          <w:tcPr>
+            <w:tcW w:type="dxa" w:w="1152"/>
+            <w:shd w:val="clear" w:color="auto" w:fill="1F497D"/>
+          </w:tcPr>
+          <w:p>
+            <w:r>
+              <w:rPr>
+                <w:b/>
+                <w:color w:val="FFFFFF"/>
+                <w:sz w:val="20"/>
+              </w:rPr>
+              <w:t>MAE</w:t>
+            </w:r>
+          </w:p>
+        </w:tc>
+        <w:tc>
+          <w:tcPr>
+            <w:tcW w:type="dxa" w:w="1152"/>
+            <w:shd w:val="clear" w:color="auto" w:fill="1F497D"/>
+          </w:tcPr>
+          <w:p>
+            <w:r>
+              <w:rPr>
+                <w:b/>
+                <w:color w:val="FFFFFF"/>
+                <w:sz w:val="20"/>
+              </w:rPr>
+              <w:t>RMSE</w:t>
+            </w:r>
+          </w:p>
+        </w:tc>
+        <w:tc>
+          <w:tcPr>
+            <w:tcW w:type="dxa" w:w="1152"/>
+            <w:shd w:val="clear" w:color="auto" w:fill="1F497D"/>
+          </w:tcPr>
+          <w:p>
+            <w:r>
+              <w:rPr>
+                <w:b/>
+                <w:color w:val="FFFFFF"/>
+                <w:sz w:val="20"/>
+              </w:rPr>
+              <w:t>R²</w:t>
+            </w:r>
+          </w:p>
+        </w:tc>
+        <w:tc>
+          <w:tcPr>
+            <w:tcW w:type="dxa" w:w="1296"/>
+            <w:shd w:val="clear" w:color="auto" w:fill="1F497D"/>
+          </w:tcPr>
+          <w:p>
+            <w:r>
+              <w:rPr>
+                <w:b/>
+                <w:color w:val="FFFFFF"/>
+                <w:sz w:val="20"/>
+              </w:rPr>
+              <w:t>Pearson r</w:t>
+            </w:r>
+          </w:p>
+        </w:tc>
+        <w:tc>
+          <w:tcPr>
+            <w:tcW w:type="dxa" w:w="1296"/>
+            <w:shd w:val="clear" w:color="auto" w:fill="1F497D"/>
+          </w:tcPr>
+          <w:p>
+            <w:r>
+              <w:rPr>
+                <w:b/>
+                <w:color w:val="FFFFFF"/>
+                <w:sz w:val="20"/>
+              </w:rPr>
+              <w:t>Spearman ρ</w:t>
+            </w:r>
+          </w:p>
+        </w:tc>
+      </w:tr>
+      <w:tr>
+        <w:tc>
+          <w:tcPr>
+            <w:tcW w:type="dxa" w:w="1296"/>
+            <w:shd w:val="clear" w:color="auto" w:fill="F2F7FF"/>
+          </w:tcPr>
+          <w:p>
+            <w:r>
+              <w:rPr>
+                <w:color w:val="595959"/>
+                <w:sz w:val="20"/>
+              </w:rPr>
+              <w:t>1</w:t>
+            </w:r>
+          </w:p>
+        </w:tc>
+        <w:tc>
+          <w:tcPr>
+            <w:tcW w:type="dxa" w:w="1152"/>
+            <w:shd w:val="clear" w:color="auto" w:fill="F2F7FF"/>
+          </w:tcPr>
+          <w:p>
+            <w:r>
+              <w:rPr>
+                <w:color w:val="595959"/>
+                <w:sz w:val="20"/>
+              </w:rPr>
+              <w:t>0.2816</w:t>
+            </w:r>
+          </w:p>
+        </w:tc>
+        <w:tc>
+          <w:tcPr>
+            <w:tcW w:type="dxa" w:w="1152"/>
+            <w:shd w:val="clear" w:color="auto" w:fill="F2F7FF"/>
+          </w:tcPr>
+          <w:p>
+            <w:r>
+              <w:rPr>
+                <w:color w:val="595959"/>
+                <w:sz w:val="20"/>
+              </w:rPr>
+              <w:t>0.3613</w:t>
+            </w:r>
+          </w:p>
+        </w:tc>
+        <w:tc>
+          <w:tcPr>
+            <w:tcW w:type="dxa" w:w="1152"/>
+            <w:shd w:val="clear" w:color="auto" w:fill="F2F7FF"/>
+          </w:tcPr>
+          <w:p>
+            <w:r>
+              <w:rPr>
+                <w:color w:val="595959"/>
+                <w:sz w:val="20"/>
+              </w:rPr>
+              <w:t>0.5307</w:t>
+            </w:r>
+          </w:p>
+        </w:tc>
+        <w:tc>
+          <w:tcPr>
+            <w:tcW w:type="dxa" w:w="1152"/>
+            <w:shd w:val="clear" w:color="auto" w:fill="F2F7FF"/>
+          </w:tcPr>
+          <w:p>
+            <w:r>
+              <w:rPr>
+                <w:color w:val="595959"/>
+                <w:sz w:val="20"/>
+              </w:rPr>
+              <w:t>0.6018</w:t>
+            </w:r>
+          </w:p>
+        </w:tc>
+        <w:tc>
+          <w:tcPr>
+            <w:tcW w:type="dxa" w:w="1296"/>
+            <w:shd w:val="clear" w:color="auto" w:fill="F2F7FF"/>
+          </w:tcPr>
+          <w:p>
+            <w:r>
+              <w:rPr>
+                <w:color w:val="595959"/>
+                <w:sz w:val="20"/>
+              </w:rPr>
+              <w:t>0.7807</w:t>
+            </w:r>
+          </w:p>
+        </w:tc>
+        <w:tc>
+          <w:tcPr>
+            <w:tcW w:type="dxa" w:w="1296"/>
+            <w:shd w:val="clear" w:color="auto" w:fill="F2F7FF"/>
+          </w:tcPr>
+          <w:p>
+            <w:r>
+              <w:rPr>
+                <w:color w:val="595959"/>
+                <w:sz w:val="20"/>
+              </w:rPr>
+              <w:t>0.7515</w:t>
+            </w:r>
+          </w:p>
+        </w:tc>
+      </w:tr>
+      <w:tr>
+        <w:tc>
+          <w:tcPr>
+            <w:tcW w:type="dxa" w:w="1296"/>
+            <w:shd w:val="clear" w:color="auto" w:fill="FFFFFF"/>
+          </w:tcPr>
+          <w:p>
+            <w:r>
+              <w:rPr>
+                <w:color w:val="595959"/>
+                <w:sz w:val="20"/>
+              </w:rPr>
+              <w:t>2</w:t>
+            </w:r>
+          </w:p>
+        </w:tc>
+        <w:tc>
+          <w:tcPr>
+            <w:tcW w:type="dxa" w:w="1152"/>
+            <w:shd w:val="clear" w:color="auto" w:fill="FFFFFF"/>
+          </w:tcPr>
+          <w:p>
+            <w:r>
+              <w:rPr>
+                <w:color w:val="595959"/>
+                <w:sz w:val="20"/>
+              </w:rPr>
+              <w:t>0.2844</w:t>
+            </w:r>
+          </w:p>
+        </w:tc>
+        <w:tc>
+          <w:tcPr>
+            <w:tcW w:type="dxa" w:w="1152"/>
+            <w:shd w:val="clear" w:color="auto" w:fill="FFFFFF"/>
+          </w:tcPr>
+          <w:p>
+            <w:r>
+              <w:rPr>
+                <w:color w:val="595959"/>
+                <w:sz w:val="20"/>
+              </w:rPr>
+              <w:t>0.3659</w:t>
+            </w:r>
+          </w:p>
+        </w:tc>
+        <w:tc>
+          <w:tcPr>
+            <w:tcW w:type="dxa" w:w="1152"/>
+            <w:shd w:val="clear" w:color="auto" w:fill="FFFFFF"/>
+          </w:tcPr>
+          <w:p>
+            <w:r>
+              <w:rPr>
+                <w:color w:val="595959"/>
+                <w:sz w:val="20"/>
+              </w:rPr>
+              <w:t>0.5333</w:t>
+            </w:r>
+          </w:p>
+        </w:tc>
+        <w:tc>
+          <w:tcPr>
+            <w:tcW w:type="dxa" w:w="1152"/>
+            <w:shd w:val="clear" w:color="auto" w:fill="FFFFFF"/>
+          </w:tcPr>
+          <w:p>
+            <w:r>
+              <w:rPr>
+                <w:color w:val="595959"/>
+                <w:sz w:val="20"/>
+              </w:rPr>
+              <w:t>0.5979</w:t>
+            </w:r>
+          </w:p>
+        </w:tc>
+        <w:tc>
+          <w:tcPr>
+            <w:tcW w:type="dxa" w:w="1296"/>
+            <w:shd w:val="clear" w:color="auto" w:fill="FFFFFF"/>
+          </w:tcPr>
+          <w:p>
+            <w:r>
+              <w:rPr>
+                <w:color w:val="595959"/>
+                <w:sz w:val="20"/>
+              </w:rPr>
+              <w:t>0.7776</w:t>
+            </w:r>
+          </w:p>
+        </w:tc>
+        <w:tc>
+          <w:tcPr>
+            <w:tcW w:type="dxa" w:w="1296"/>
+            <w:shd w:val="clear" w:color="auto" w:fill="FFFFFF"/>
+          </w:tcPr>
+          <w:p>
+            <w:r>
+              <w:rPr>
+                <w:color w:val="595959"/>
+                <w:sz w:val="20"/>
+              </w:rPr>
+              <w:t>0.7437</w:t>
+            </w:r>
+          </w:p>
+        </w:tc>
+      </w:tr>
+      <w:tr>
+        <w:tc>
+          <w:tcPr>
+            <w:tcW w:type="dxa" w:w="1296"/>
+            <w:shd w:val="clear" w:color="auto" w:fill="F2F7FF"/>
+          </w:tcPr>
+          <w:p>
+            <w:r>
+              <w:rPr>
+                <w:color w:val="595959"/>
+                <w:sz w:val="20"/>
+              </w:rPr>
+              <w:t>3</w:t>
+            </w:r>
+          </w:p>
+        </w:tc>
+        <w:tc>
+          <w:tcPr>
+            <w:tcW w:type="dxa" w:w="1152"/>
+            <w:shd w:val="clear" w:color="auto" w:fill="F2F7FF"/>
+          </w:tcPr>
+          <w:p>
+            <w:r>
+              <w:rPr>
+                <w:color w:val="595959"/>
+                <w:sz w:val="20"/>
+              </w:rPr>
+              <w:t>0.2843</w:t>
+            </w:r>
+          </w:p>
+        </w:tc>
+        <w:tc>
+          <w:tcPr>
+            <w:tcW w:type="dxa" w:w="1152"/>
+            <w:shd w:val="clear" w:color="auto" w:fill="F2F7FF"/>
+          </w:tcPr>
+          <w:p>
+            <w:r>
+              <w:rPr>
+                <w:color w:val="595959"/>
+                <w:sz w:val="20"/>
+              </w:rPr>
+              <w:t>0.3616</w:t>
+            </w:r>
+          </w:p>
+        </w:tc>
+        <w:tc>
+          <w:tcPr>
+            <w:tcW w:type="dxa" w:w="1152"/>
+            <w:shd w:val="clear" w:color="auto" w:fill="F2F7FF"/>
+          </w:tcPr>
+          <w:p>
+            <w:r>
+              <w:rPr>
+                <w:color w:val="595959"/>
+                <w:sz w:val="20"/>
+              </w:rPr>
+              <w:t>0.5332</w:t>
+            </w:r>
+          </w:p>
+        </w:tc>
+        <w:tc>
+          <w:tcPr>
+            <w:tcW w:type="dxa" w:w="1152"/>
+            <w:shd w:val="clear" w:color="auto" w:fill="F2F7FF"/>
+          </w:tcPr>
+          <w:p>
+            <w:r>
+              <w:rPr>
+                <w:color w:val="595959"/>
+                <w:sz w:val="20"/>
+              </w:rPr>
+              <w:t>0.5981</w:t>
+            </w:r>
+          </w:p>
+        </w:tc>
+        <w:tc>
+          <w:tcPr>
+            <w:tcW w:type="dxa" w:w="1296"/>
+            <w:shd w:val="clear" w:color="auto" w:fill="F2F7FF"/>
+          </w:tcPr>
+          <w:p>
+            <w:r>
+              <w:rPr>
+                <w:color w:val="595959"/>
+                <w:sz w:val="20"/>
+              </w:rPr>
+              <w:t>0.7780</w:t>
+            </w:r>
+          </w:p>
+        </w:tc>
+        <w:tc>
+          <w:tcPr>
+            <w:tcW w:type="dxa" w:w="1296"/>
+            <w:shd w:val="clear" w:color="auto" w:fill="F2F7FF"/>
+          </w:tcPr>
+          <w:p>
+            <w:r>
+              <w:rPr>
+                <w:color w:val="595959"/>
+                <w:sz w:val="20"/>
+              </w:rPr>
+              <w:t>0.7483</w:t>
+            </w:r>
+          </w:p>
+        </w:tc>
+      </w:tr>
+      <w:tr>
+        <w:tc>
+          <w:tcPr>
+            <w:tcW w:type="dxa" w:w="1296"/>
+            <w:shd w:val="clear" w:color="auto" w:fill="FFFFFF"/>
+          </w:tcPr>
+          <w:p>
+            <w:r>
+              <w:rPr>
+                <w:color w:val="595959"/>
+                <w:sz w:val="20"/>
+              </w:rPr>
+              <w:t>4</w:t>
+            </w:r>
+          </w:p>
+        </w:tc>
+        <w:tc>
+          <w:tcPr>
+            <w:tcW w:type="dxa" w:w="1152"/>
+            <w:shd w:val="clear" w:color="auto" w:fill="FFFFFF"/>
+          </w:tcPr>
+          <w:p>
+            <w:r>
+              <w:rPr>
+                <w:color w:val="595959"/>
+                <w:sz w:val="20"/>
+              </w:rPr>
+              <w:t>0.2551</w:t>
+            </w:r>
+          </w:p>
+        </w:tc>
+        <w:tc>
+          <w:tcPr>
+            <w:tcW w:type="dxa" w:w="1152"/>
+            <w:shd w:val="clear" w:color="auto" w:fill="FFFFFF"/>
+          </w:tcPr>
+          <w:p>
+            <w:r>
+              <w:rPr>
+                <w:color w:val="595959"/>
+                <w:sz w:val="20"/>
+              </w:rPr>
+              <w:t>0.3389</w:t>
+            </w:r>
+          </w:p>
+        </w:tc>
+        <w:tc>
+          <w:tcPr>
+            <w:tcW w:type="dxa" w:w="1152"/>
+            <w:shd w:val="clear" w:color="auto" w:fill="FFFFFF"/>
+          </w:tcPr>
+          <w:p>
+            <w:r>
+              <w:rPr>
+                <w:color w:val="595959"/>
+                <w:sz w:val="20"/>
+              </w:rPr>
+              <w:t>0.5050</w:t>
+            </w:r>
+          </w:p>
+        </w:tc>
+        <w:tc>
+          <w:tcPr>
+            <w:tcW w:type="dxa" w:w="1152"/>
+            <w:shd w:val="clear" w:color="auto" w:fill="FFFFFF"/>
+          </w:tcPr>
+          <w:p>
+            <w:r>
+              <w:rPr>
+                <w:color w:val="595959"/>
+                <w:sz w:val="20"/>
+              </w:rPr>
+              <w:t>0.6394</w:t>
+            </w:r>
+          </w:p>
+        </w:tc>
+        <w:tc>
+          <w:tcPr>
+            <w:tcW w:type="dxa" w:w="1296"/>
+            <w:shd w:val="clear" w:color="auto" w:fill="FFFFFF"/>
+          </w:tcPr>
+          <w:p>
+            <w:r>
+              <w:rPr>
+                <w:color w:val="595959"/>
+                <w:sz w:val="20"/>
+              </w:rPr>
+              <w:t>0.8039</w:t>
+            </w:r>
+          </w:p>
+        </w:tc>
+        <w:tc>
+          <w:tcPr>
+            <w:tcW w:type="dxa" w:w="1296"/>
+            <w:shd w:val="clear" w:color="auto" w:fill="FFFFFF"/>
+          </w:tcPr>
+          <w:p>
+            <w:r>
+              <w:rPr>
+                <w:color w:val="595959"/>
+                <w:sz w:val="20"/>
+              </w:rPr>
+              <w:t>0.7807</w:t>
+            </w:r>
+          </w:p>
+        </w:tc>
+      </w:tr>
+      <w:tr>
+        <w:tc>
+          <w:tcPr>
+            <w:tcW w:type="dxa" w:w="1296"/>
+            <w:shd w:val="clear" w:color="auto" w:fill="F2F7FF"/>
+          </w:tcPr>
+          <w:p>
+            <w:r>
+              <w:rPr>
+                <w:color w:val="595959"/>
+                <w:sz w:val="20"/>
+              </w:rPr>
+              <w:t>5</w:t>
+            </w:r>
+          </w:p>
+        </w:tc>
+        <w:tc>
+          <w:tcPr>
+            <w:tcW w:type="dxa" w:w="1152"/>
+            <w:shd w:val="clear" w:color="auto" w:fill="F2F7FF"/>
+          </w:tcPr>
+          <w:p>
+            <w:r>
+              <w:rPr>
+                <w:color w:val="595959"/>
+                <w:sz w:val="20"/>
+              </w:rPr>
+              <w:t>0.2633</w:t>
+            </w:r>
+          </w:p>
+        </w:tc>
+        <w:tc>
+          <w:tcPr>
+            <w:tcW w:type="dxa" w:w="1152"/>
+            <w:shd w:val="clear" w:color="auto" w:fill="F2F7FF"/>
+          </w:tcPr>
+          <w:p>
+            <w:r>
+              <w:rPr>
+                <w:color w:val="595959"/>
+                <w:sz w:val="20"/>
+              </w:rPr>
+              <w:t>0.3405</w:t>
+            </w:r>
+          </w:p>
+        </w:tc>
+        <w:tc>
+          <w:tcPr>
+            <w:tcW w:type="dxa" w:w="1152"/>
+            <w:shd w:val="clear" w:color="auto" w:fill="F2F7FF"/>
+          </w:tcPr>
+          <w:p>
+            <w:r>
+              <w:rPr>
+                <w:color w:val="595959"/>
+                <w:sz w:val="20"/>
+              </w:rPr>
+              <w:t>0.5131</w:t>
+            </w:r>
+          </w:p>
+        </w:tc>
+        <w:tc>
+          <w:tcPr>
+            <w:tcW w:type="dxa" w:w="1152"/>
+            <w:shd w:val="clear" w:color="auto" w:fill="F2F7FF"/>
+          </w:tcPr>
+          <w:p>
+            <w:r>
+              <w:rPr>
+                <w:color w:val="595959"/>
+                <w:sz w:val="20"/>
+              </w:rPr>
+              <w:t>0.6278</w:t>
+            </w:r>
+          </w:p>
+        </w:tc>
+        <w:tc>
+          <w:tcPr>
+            <w:tcW w:type="dxa" w:w="1296"/>
+            <w:shd w:val="clear" w:color="auto" w:fill="F2F7FF"/>
+          </w:tcPr>
+          <w:p>
+            <w:r>
+              <w:rPr>
+                <w:color w:val="595959"/>
+                <w:sz w:val="20"/>
+              </w:rPr>
+              <w:t>0.7957</w:t>
+            </w:r>
+          </w:p>
+        </w:tc>
+        <w:tc>
+          <w:tcPr>
+            <w:tcW w:type="dxa" w:w="1296"/>
+            <w:shd w:val="clear" w:color="auto" w:fill="F2F7FF"/>
+          </w:tcPr>
+          <w:p>
+            <w:r>
+              <w:rPr>
+                <w:color w:val="595959"/>
+                <w:sz w:val="20"/>
+              </w:rPr>
+              <w:t>0.7700</w:t>
+            </w:r>
+          </w:p>
+        </w:tc>
+      </w:tr>
+      <w:tr>
+        <w:tc>
+          <w:tcPr>
+            <w:tcW w:type="dxa" w:w="1296"/>
+            <w:shd w:val="clear" w:color="auto" w:fill="FFFFFF"/>
+          </w:tcPr>
+          <w:p>
+            <w:r>
+              <w:rPr>
+                <w:color w:val="595959"/>
+                <w:sz w:val="20"/>
+              </w:rPr>
+              <w:t>Mean ± std</w:t>
+            </w:r>
+          </w:p>
+        </w:tc>
+        <w:tc>
+          <w:tcPr>
+            <w:tcW w:type="dxa" w:w="1152"/>
+            <w:shd w:val="clear" w:color="auto" w:fill="FFFFFF"/>
+          </w:tcPr>
+          <w:p>
+            <w:r>
+              <w:rPr>
+                <w:color w:val="595959"/>
+                <w:sz w:val="20"/>
+              </w:rPr>
+              <w:t>0.274 ± 0.014</w:t>
+            </w:r>
+          </w:p>
+        </w:tc>
+        <w:tc>
+          <w:tcPr>
+            <w:tcW w:type="dxa" w:w="1152"/>
+            <w:shd w:val="clear" w:color="auto" w:fill="FFFFFF"/>
+          </w:tcPr>
+          <w:p>
+            <w:r>
+              <w:rPr>
+                <w:color w:val="595959"/>
+                <w:sz w:val="20"/>
+              </w:rPr>
+              <w:t>0.354 ± 0.013</w:t>
+            </w:r>
+          </w:p>
+        </w:tc>
+        <w:tc>
+          <w:tcPr>
+            <w:tcW w:type="dxa" w:w="1152"/>
+            <w:shd w:val="clear" w:color="auto" w:fill="FFFFFF"/>
+          </w:tcPr>
+          <w:p>
+            <w:r>
+              <w:rPr>
+                <w:color w:val="595959"/>
+                <w:sz w:val="20"/>
+              </w:rPr>
+              <w:t>0.523 ± 0.013</w:t>
+            </w:r>
+          </w:p>
+        </w:tc>
+        <w:tc>
+          <w:tcPr>
+            <w:tcW w:type="dxa" w:w="1152"/>
+            <w:shd w:val="clear" w:color="auto" w:fill="FFFFFF"/>
+          </w:tcPr>
+          <w:p>
+            <w:r>
+              <w:rPr>
+                <w:color w:val="595959"/>
+                <w:sz w:val="20"/>
+              </w:rPr>
+              <w:t>0.613 ± 0.019</w:t>
+            </w:r>
+          </w:p>
+        </w:tc>
+        <w:tc>
+          <w:tcPr>
+            <w:tcW w:type="dxa" w:w="1296"/>
+            <w:shd w:val="clear" w:color="auto" w:fill="FFFFFF"/>
+          </w:tcPr>
+          <w:p>
+            <w:r>
+              <w:rPr>
+                <w:color w:val="595959"/>
+                <w:sz w:val="20"/>
+              </w:rPr>
+              <w:t>0.787 ± 0.012</w:t>
+            </w:r>
+          </w:p>
+        </w:tc>
+        <w:tc>
+          <w:tcPr>
+            <w:tcW w:type="dxa" w:w="1296"/>
+            <w:shd w:val="clear" w:color="auto" w:fill="FFFFFF"/>
+          </w:tcPr>
+          <w:p>
+            <w:r>
+              <w:rPr>
+                <w:color w:val="595959"/>
+                <w:sz w:val="20"/>
+              </w:rPr>
+              <w:t>0.759 ± 0.016</w:t>
+            </w:r>
+          </w:p>
+        </w:tc>
+      </w:tr>
+    </w:tbl>
+    <w:p/>
+    <w:p>
+      <w:pPr>
+        <w:spacing w:before="160" w:after="40"/>
+      </w:pPr>
+      <w:r>
+        <w:rPr>
+          <w:b/>
+          <w:color w:val="1F497D"/>
+          <w:sz w:val="22"/>
+        </w:rPr>
+        <w:t>DTA Comparison: H-GNN-RNN-DTI vs. ConcatBaseline (5 Seeds, Paired t-test)</w:t>
       </w:r>
     </w:p>
     <w:tbl>
@@ -5390,7 +6950,7 @@
       <w:tr>
         <w:tc>
           <w:tcPr>
-            <w:tcW w:type="dxa" w:w="2160"/>
+            <w:tcW w:type="dxa" w:w="1008"/>
             <w:shd w:val="clear" w:color="auto" w:fill="1F497D"/>
           </w:tcPr>
           <w:p>
@@ -5400,13 +6960,13 @@
                 <w:color w:val="FFFFFF"/>
                 <w:sz w:val="20"/>
               </w:rPr>
-              <w:t>Seed</w:t>
-            </w:r>
-          </w:p>
-        </w:tc>
-        <w:tc>
-          <w:tcPr>
-            <w:tcW w:type="dxa" w:w="1296"/>
+              <w:t>Dataset</w:t>
+            </w:r>
+          </w:p>
+        </w:tc>
+        <w:tc>
+          <w:tcPr>
+            <w:tcW w:type="dxa" w:w="1440"/>
             <w:shd w:val="clear" w:color="auto" w:fill="1F497D"/>
           </w:tcPr>
           <w:p>
@@ -5416,13 +6976,13 @@
                 <w:color w:val="FFFFFF"/>
                 <w:sz w:val="20"/>
               </w:rPr>
-              <w:t>MSE</w:t>
-            </w:r>
-          </w:p>
-        </w:tc>
-        <w:tc>
-          <w:tcPr>
-            <w:tcW w:type="dxa" w:w="1296"/>
+              <w:t>Metric</w:t>
+            </w:r>
+          </w:p>
+        </w:tc>
+        <w:tc>
+          <w:tcPr>
+            <w:tcW w:type="dxa" w:w="1872"/>
             <w:shd w:val="clear" w:color="auto" w:fill="1F497D"/>
           </w:tcPr>
           <w:p>
@@ -5432,13 +6992,13 @@
                 <w:color w:val="FFFFFF"/>
                 <w:sz w:val="20"/>
               </w:rPr>
-              <w:t>RMSE</w:t>
-            </w:r>
-          </w:p>
-        </w:tc>
-        <w:tc>
-          <w:tcPr>
-            <w:tcW w:type="dxa" w:w="1152"/>
+              <w:t>H-GNN</w:t>
+            </w:r>
+          </w:p>
+        </w:tc>
+        <w:tc>
+          <w:tcPr>
+            <w:tcW w:type="dxa" w:w="1872"/>
             <w:shd w:val="clear" w:color="auto" w:fill="1F497D"/>
           </w:tcPr>
           <w:p>
@@ -5448,13 +7008,13 @@
                 <w:color w:val="FFFFFF"/>
                 <w:sz w:val="20"/>
               </w:rPr>
-              <w:t>R²</w:t>
-            </w:r>
-          </w:p>
-        </w:tc>
-        <w:tc>
-          <w:tcPr>
-            <w:tcW w:type="dxa" w:w="1296"/>
+              <w:t>ConcatBaseline</w:t>
+            </w:r>
+          </w:p>
+        </w:tc>
+        <w:tc>
+          <w:tcPr>
+            <w:tcW w:type="dxa" w:w="1008"/>
             <w:shd w:val="clear" w:color="auto" w:fill="1F497D"/>
           </w:tcPr>
           <w:p>
@@ -5464,13 +7024,13 @@
                 <w:color w:val="FFFFFF"/>
                 <w:sz w:val="20"/>
               </w:rPr>
-              <w:t>Pearson r</w:t>
-            </w:r>
-          </w:p>
-        </w:tc>
-        <w:tc>
-          <w:tcPr>
-            <w:tcW w:type="dxa" w:w="1296"/>
+              <w:t>Δ</w:t>
+            </w:r>
+          </w:p>
+        </w:tc>
+        <w:tc>
+          <w:tcPr>
+            <w:tcW w:type="dxa" w:w="1440"/>
             <w:shd w:val="clear" w:color="auto" w:fill="1F497D"/>
           </w:tcPr>
           <w:p>
@@ -5480,7 +7040,7 @@
                 <w:color w:val="FFFFFF"/>
                 <w:sz w:val="20"/>
               </w:rPr>
-              <w:t>Spearman ρ</w:t>
+              <w:t>p-value</w:t>
             </w:r>
           </w:p>
         </w:tc>
@@ -5488,7 +7048,7 @@
       <w:tr>
         <w:tc>
           <w:tcPr>
-            <w:tcW w:type="dxa" w:w="2160"/>
+            <w:tcW w:type="dxa" w:w="1008"/>
             <w:shd w:val="clear" w:color="auto" w:fill="F2F7FF"/>
           </w:tcPr>
           <w:p>
@@ -5497,13 +7057,13 @@
                 <w:color w:val="595959"/>
                 <w:sz w:val="20"/>
               </w:rPr>
-              <w:t>1</w:t>
-            </w:r>
-          </w:p>
-        </w:tc>
-        <w:tc>
-          <w:tcPr>
-            <w:tcW w:type="dxa" w:w="1296"/>
+              <w:t>Davis</w:t>
+            </w:r>
+          </w:p>
+        </w:tc>
+        <w:tc>
+          <w:tcPr>
+            <w:tcW w:type="dxa" w:w="1440"/>
             <w:shd w:val="clear" w:color="auto" w:fill="F2F7FF"/>
           </w:tcPr>
           <w:p>
@@ -5512,13 +7072,13 @@
                 <w:color w:val="595959"/>
                 <w:sz w:val="20"/>
               </w:rPr>
-              <w:t>0.378</w:t>
-            </w:r>
-          </w:p>
-        </w:tc>
-        <w:tc>
-          <w:tcPr>
-            <w:tcW w:type="dxa" w:w="1296"/>
+              <w:t>MSE ↓</w:t>
+            </w:r>
+          </w:p>
+        </w:tc>
+        <w:tc>
+          <w:tcPr>
+            <w:tcW w:type="dxa" w:w="1872"/>
             <w:shd w:val="clear" w:color="auto" w:fill="F2F7FF"/>
           </w:tcPr>
           <w:p>
@@ -5527,13 +7087,13 @@
                 <w:color w:val="595959"/>
                 <w:sz w:val="20"/>
               </w:rPr>
-              <w:t>0.615</w:t>
-            </w:r>
-          </w:p>
-        </w:tc>
-        <w:tc>
-          <w:tcPr>
-            <w:tcW w:type="dxa" w:w="1152"/>
+              <w:t>0.379 ± 0.011</w:t>
+            </w:r>
+          </w:p>
+        </w:tc>
+        <w:tc>
+          <w:tcPr>
+            <w:tcW w:type="dxa" w:w="1872"/>
             <w:shd w:val="clear" w:color="auto" w:fill="F2F7FF"/>
           </w:tcPr>
           <w:p>
@@ -5542,13 +7102,13 @@
                 <w:color w:val="595959"/>
                 <w:sz w:val="20"/>
               </w:rPr>
-              <w:t>0.509</w:t>
-            </w:r>
-          </w:p>
-        </w:tc>
-        <w:tc>
-          <w:tcPr>
-            <w:tcW w:type="dxa" w:w="1296"/>
+              <w:t>0.468 ± 0.029</w:t>
+            </w:r>
+          </w:p>
+        </w:tc>
+        <w:tc>
+          <w:tcPr>
+            <w:tcW w:type="dxa" w:w="1008"/>
             <w:shd w:val="clear" w:color="auto" w:fill="F2F7FF"/>
           </w:tcPr>
           <w:p>
@@ -5557,13 +7117,13 @@
                 <w:color w:val="595959"/>
                 <w:sz w:val="20"/>
               </w:rPr>
-              <w:t>0.723</w:t>
-            </w:r>
-          </w:p>
-        </w:tc>
-        <w:tc>
-          <w:tcPr>
-            <w:tcW w:type="dxa" w:w="1296"/>
+              <w:t>−0.090</w:t>
+            </w:r>
+          </w:p>
+        </w:tc>
+        <w:tc>
+          <w:tcPr>
+            <w:tcW w:type="dxa" w:w="1440"/>
             <w:shd w:val="clear" w:color="auto" w:fill="F2F7FF"/>
           </w:tcPr>
           <w:p>
@@ -5572,7 +7132,7 @@
                 <w:color w:val="595959"/>
                 <w:sz w:val="20"/>
               </w:rPr>
-              <w:t>0.607</w:t>
+              <w:t>0.003  ✓✓</w:t>
             </w:r>
           </w:p>
         </w:tc>
@@ -5580,7 +7140,7 @@
       <w:tr>
         <w:tc>
           <w:tcPr>
-            <w:tcW w:type="dxa" w:w="2160"/>
+            <w:tcW w:type="dxa" w:w="1008"/>
             <w:shd w:val="clear" w:color="auto" w:fill="FFFFFF"/>
           </w:tcPr>
           <w:p>
@@ -5589,13 +7149,13 @@
                 <w:color w:val="595959"/>
                 <w:sz w:val="20"/>
               </w:rPr>
-              <w:t>2</w:t>
-            </w:r>
-          </w:p>
-        </w:tc>
-        <w:tc>
-          <w:tcPr>
-            <w:tcW w:type="dxa" w:w="1296"/>
+              <w:t>Davis</w:t>
+            </w:r>
+          </w:p>
+        </w:tc>
+        <w:tc>
+          <w:tcPr>
+            <w:tcW w:type="dxa" w:w="1440"/>
             <w:shd w:val="clear" w:color="auto" w:fill="FFFFFF"/>
           </w:tcPr>
           <w:p>
@@ -5604,13 +7164,13 @@
                 <w:color w:val="595959"/>
                 <w:sz w:val="20"/>
               </w:rPr>
-              <w:t>0.383</w:t>
-            </w:r>
-          </w:p>
-        </w:tc>
-        <w:tc>
-          <w:tcPr>
-            <w:tcW w:type="dxa" w:w="1296"/>
+              <w:t>MAE ↓</w:t>
+            </w:r>
+          </w:p>
+        </w:tc>
+        <w:tc>
+          <w:tcPr>
+            <w:tcW w:type="dxa" w:w="1872"/>
             <w:shd w:val="clear" w:color="auto" w:fill="FFFFFF"/>
           </w:tcPr>
           <w:p>
@@ -5619,13 +7179,13 @@
                 <w:color w:val="595959"/>
                 <w:sz w:val="20"/>
               </w:rPr>
-              <w:t>0.619</w:t>
-            </w:r>
-          </w:p>
-        </w:tc>
-        <w:tc>
-          <w:tcPr>
-            <w:tcW w:type="dxa" w:w="1152"/>
+              <w:t>0.415 ± 0.008</w:t>
+            </w:r>
+          </w:p>
+        </w:tc>
+        <w:tc>
+          <w:tcPr>
+            <w:tcW w:type="dxa" w:w="1872"/>
             <w:shd w:val="clear" w:color="auto" w:fill="FFFFFF"/>
           </w:tcPr>
           <w:p>
@@ -5634,13 +7194,13 @@
                 <w:color w:val="595959"/>
                 <w:sz w:val="20"/>
               </w:rPr>
-              <w:t>0.502</w:t>
-            </w:r>
-          </w:p>
-        </w:tc>
-        <w:tc>
-          <w:tcPr>
-            <w:tcW w:type="dxa" w:w="1296"/>
+              <w:t>0.444 ± 0.021</w:t>
+            </w:r>
+          </w:p>
+        </w:tc>
+        <w:tc>
+          <w:tcPr>
+            <w:tcW w:type="dxa" w:w="1008"/>
             <w:shd w:val="clear" w:color="auto" w:fill="FFFFFF"/>
           </w:tcPr>
           <w:p>
@@ -5649,13 +7209,13 @@
                 <w:color w:val="595959"/>
                 <w:sz w:val="20"/>
               </w:rPr>
-              <w:t>0.719</w:t>
-            </w:r>
-          </w:p>
-        </w:tc>
-        <w:tc>
-          <w:tcPr>
-            <w:tcW w:type="dxa" w:w="1296"/>
+              <w:t>−0.029</w:t>
+            </w:r>
+          </w:p>
+        </w:tc>
+        <w:tc>
+          <w:tcPr>
+            <w:tcW w:type="dxa" w:w="1440"/>
             <w:shd w:val="clear" w:color="auto" w:fill="FFFFFF"/>
           </w:tcPr>
           <w:p>
@@ -5664,7 +7224,7 @@
                 <w:color w:val="595959"/>
                 <w:sz w:val="20"/>
               </w:rPr>
-              <w:t>0.606</w:t>
+              <w:t>0.028  ✓</w:t>
             </w:r>
           </w:p>
         </w:tc>
@@ -5672,7 +7232,7 @@
       <w:tr>
         <w:tc>
           <w:tcPr>
-            <w:tcW w:type="dxa" w:w="2160"/>
+            <w:tcW w:type="dxa" w:w="1008"/>
             <w:shd w:val="clear" w:color="auto" w:fill="F2F7FF"/>
           </w:tcPr>
           <w:p>
@@ -5681,13 +7241,13 @@
                 <w:color w:val="595959"/>
                 <w:sz w:val="20"/>
               </w:rPr>
-              <w:t>3</w:t>
-            </w:r>
-          </w:p>
-        </w:tc>
-        <w:tc>
-          <w:tcPr>
-            <w:tcW w:type="dxa" w:w="1296"/>
+              <w:t>Davis</w:t>
+            </w:r>
+          </w:p>
+        </w:tc>
+        <w:tc>
+          <w:tcPr>
+            <w:tcW w:type="dxa" w:w="1440"/>
             <w:shd w:val="clear" w:color="auto" w:fill="F2F7FF"/>
           </w:tcPr>
           <w:p>
@@ -5696,13 +7256,13 @@
                 <w:color w:val="595959"/>
                 <w:sz w:val="20"/>
               </w:rPr>
-              <w:t>0.376</w:t>
-            </w:r>
-          </w:p>
-        </w:tc>
-        <w:tc>
-          <w:tcPr>
-            <w:tcW w:type="dxa" w:w="1296"/>
+              <w:t>Pearson r ↑</w:t>
+            </w:r>
+          </w:p>
+        </w:tc>
+        <w:tc>
+          <w:tcPr>
+            <w:tcW w:type="dxa" w:w="1872"/>
             <w:shd w:val="clear" w:color="auto" w:fill="F2F7FF"/>
           </w:tcPr>
           <w:p>
@@ -5711,13 +7271,13 @@
                 <w:color w:val="595959"/>
                 <w:sz w:val="20"/>
               </w:rPr>
-              <w:t>0.613</w:t>
-            </w:r>
-          </w:p>
-        </w:tc>
-        <w:tc>
-          <w:tcPr>
-            <w:tcW w:type="dxa" w:w="1152"/>
+              <w:t>0.721 ± 0.013</w:t>
+            </w:r>
+          </w:p>
+        </w:tc>
+        <w:tc>
+          <w:tcPr>
+            <w:tcW w:type="dxa" w:w="1872"/>
             <w:shd w:val="clear" w:color="auto" w:fill="F2F7FF"/>
           </w:tcPr>
           <w:p>
@@ -5726,13 +7286,13 @@
                 <w:color w:val="595959"/>
                 <w:sz w:val="20"/>
               </w:rPr>
-              <w:t>0.511</w:t>
-            </w:r>
-          </w:p>
-        </w:tc>
-        <w:tc>
-          <w:tcPr>
-            <w:tcW w:type="dxa" w:w="1296"/>
+              <w:t>0.626 ± 0.030</w:t>
+            </w:r>
+          </w:p>
+        </w:tc>
+        <w:tc>
+          <w:tcPr>
+            <w:tcW w:type="dxa" w:w="1008"/>
             <w:shd w:val="clear" w:color="auto" w:fill="F2F7FF"/>
           </w:tcPr>
           <w:p>
@@ -5741,13 +7301,13 @@
                 <w:color w:val="595959"/>
                 <w:sz w:val="20"/>
               </w:rPr>
-              <w:t>0.724</w:t>
-            </w:r>
-          </w:p>
-        </w:tc>
-        <w:tc>
-          <w:tcPr>
-            <w:tcW w:type="dxa" w:w="1296"/>
+              <w:t>+0.095</w:t>
+            </w:r>
+          </w:p>
+        </w:tc>
+        <w:tc>
+          <w:tcPr>
+            <w:tcW w:type="dxa" w:w="1440"/>
             <w:shd w:val="clear" w:color="auto" w:fill="F2F7FF"/>
           </w:tcPr>
           <w:p>
@@ -5756,7 +7316,7 @@
                 <w:color w:val="595959"/>
                 <w:sz w:val="20"/>
               </w:rPr>
-              <w:t>0.616</w:t>
+              <w:t>0.003  ✓✓</w:t>
             </w:r>
           </w:p>
         </w:tc>
@@ -5764,7 +7324,7 @@
       <w:tr>
         <w:tc>
           <w:tcPr>
-            <w:tcW w:type="dxa" w:w="2160"/>
+            <w:tcW w:type="dxa" w:w="1008"/>
             <w:shd w:val="clear" w:color="auto" w:fill="FFFFFF"/>
           </w:tcPr>
           <w:p>
@@ -5773,13 +7333,13 @@
                 <w:color w:val="595959"/>
                 <w:sz w:val="20"/>
               </w:rPr>
-              <w:t>4</w:t>
-            </w:r>
-          </w:p>
-        </w:tc>
-        <w:tc>
-          <w:tcPr>
-            <w:tcW w:type="dxa" w:w="1296"/>
+              <w:t>Davis</w:t>
+            </w:r>
+          </w:p>
+        </w:tc>
+        <w:tc>
+          <w:tcPr>
+            <w:tcW w:type="dxa" w:w="1440"/>
             <w:shd w:val="clear" w:color="auto" w:fill="FFFFFF"/>
           </w:tcPr>
           <w:p>
@@ -5788,13 +7348,13 @@
                 <w:color w:val="595959"/>
                 <w:sz w:val="20"/>
               </w:rPr>
-              <w:t>0.393</w:t>
-            </w:r>
-          </w:p>
-        </w:tc>
-        <w:tc>
-          <w:tcPr>
-            <w:tcW w:type="dxa" w:w="1296"/>
+              <w:t>R² ↑</w:t>
+            </w:r>
+          </w:p>
+        </w:tc>
+        <w:tc>
+          <w:tcPr>
+            <w:tcW w:type="dxa" w:w="1872"/>
             <w:shd w:val="clear" w:color="auto" w:fill="FFFFFF"/>
           </w:tcPr>
           <w:p>
@@ -5803,13 +7363,13 @@
                 <w:color w:val="595959"/>
                 <w:sz w:val="20"/>
               </w:rPr>
-              <w:t>0.627</w:t>
-            </w:r>
-          </w:p>
-        </w:tc>
-        <w:tc>
-          <w:tcPr>
-            <w:tcW w:type="dxa" w:w="1152"/>
+              <w:t>0.508 ± 0.014</w:t>
+            </w:r>
+          </w:p>
+        </w:tc>
+        <w:tc>
+          <w:tcPr>
+            <w:tcW w:type="dxa" w:w="1872"/>
             <w:shd w:val="clear" w:color="auto" w:fill="FFFFFF"/>
           </w:tcPr>
           <w:p>
@@ -5818,13 +7378,13 @@
                 <w:color w:val="595959"/>
                 <w:sz w:val="20"/>
               </w:rPr>
-              <w:t>0.489</w:t>
-            </w:r>
-          </w:p>
-        </w:tc>
-        <w:tc>
-          <w:tcPr>
-            <w:tcW w:type="dxa" w:w="1296"/>
+              <w:t>0.391 ± 0.037</w:t>
+            </w:r>
+          </w:p>
+        </w:tc>
+        <w:tc>
+          <w:tcPr>
+            <w:tcW w:type="dxa" w:w="1008"/>
             <w:shd w:val="clear" w:color="auto" w:fill="FFFFFF"/>
           </w:tcPr>
           <w:p>
@@ -5833,13 +7393,13 @@
                 <w:color w:val="595959"/>
                 <w:sz w:val="20"/>
               </w:rPr>
-              <w:t>0.702</w:t>
-            </w:r>
-          </w:p>
-        </w:tc>
-        <w:tc>
-          <w:tcPr>
-            <w:tcW w:type="dxa" w:w="1296"/>
+              <w:t>+0.116</w:t>
+            </w:r>
+          </w:p>
+        </w:tc>
+        <w:tc>
+          <w:tcPr>
+            <w:tcW w:type="dxa" w:w="1440"/>
             <w:shd w:val="clear" w:color="auto" w:fill="FFFFFF"/>
           </w:tcPr>
           <w:p>
@@ -5848,7 +7408,7 @@
                 <w:color w:val="595959"/>
                 <w:sz w:val="20"/>
               </w:rPr>
-              <w:t>0.594</w:t>
+              <w:t>0.003  ✓✓</w:t>
             </w:r>
           </w:p>
         </w:tc>
@@ -5856,7 +7416,7 @@
       <w:tr>
         <w:tc>
           <w:tcPr>
-            <w:tcW w:type="dxa" w:w="2160"/>
+            <w:tcW w:type="dxa" w:w="1008"/>
             <w:shd w:val="clear" w:color="auto" w:fill="F2F7FF"/>
           </w:tcPr>
           <w:p>
@@ -5865,13 +7425,13 @@
                 <w:color w:val="595959"/>
                 <w:sz w:val="20"/>
               </w:rPr>
-              <w:t>Mean ± std (4 seeds)</w:t>
-            </w:r>
-          </w:p>
-        </w:tc>
-        <w:tc>
-          <w:tcPr>
-            <w:tcW w:type="dxa" w:w="1296"/>
+              <w:t>KIBA</w:t>
+            </w:r>
+          </w:p>
+        </w:tc>
+        <w:tc>
+          <w:tcPr>
+            <w:tcW w:type="dxa" w:w="1440"/>
             <w:shd w:val="clear" w:color="auto" w:fill="F2F7FF"/>
           </w:tcPr>
           <w:p>
@@ -5880,13 +7440,13 @@
                 <w:color w:val="595959"/>
                 <w:sz w:val="20"/>
               </w:rPr>
-              <w:t>0.383 ± 0.007</w:t>
-            </w:r>
-          </w:p>
-        </w:tc>
-        <w:tc>
-          <w:tcPr>
-            <w:tcW w:type="dxa" w:w="1296"/>
+              <w:t>MSE ↓</w:t>
+            </w:r>
+          </w:p>
+        </w:tc>
+        <w:tc>
+          <w:tcPr>
+            <w:tcW w:type="dxa" w:w="1872"/>
             <w:shd w:val="clear" w:color="auto" w:fill="F2F7FF"/>
           </w:tcPr>
           <w:p>
@@ -5895,13 +7455,13 @@
                 <w:color w:val="595959"/>
                 <w:sz w:val="20"/>
               </w:rPr>
-              <w:t>0.619 ± 0.005</w:t>
-            </w:r>
-          </w:p>
-        </w:tc>
-        <w:tc>
-          <w:tcPr>
-            <w:tcW w:type="dxa" w:w="1152"/>
+              <w:t>0.274 ± 0.014</w:t>
+            </w:r>
+          </w:p>
+        </w:tc>
+        <w:tc>
+          <w:tcPr>
+            <w:tcW w:type="dxa" w:w="1872"/>
             <w:shd w:val="clear" w:color="auto" w:fill="F2F7FF"/>
           </w:tcPr>
           <w:p>
@@ -5910,13 +7470,13 @@
                 <w:color w:val="595959"/>
                 <w:sz w:val="20"/>
               </w:rPr>
-              <w:t>0.503 ± 0.009</w:t>
-            </w:r>
-          </w:p>
-        </w:tc>
-        <w:tc>
-          <w:tcPr>
-            <w:tcW w:type="dxa" w:w="1296"/>
+              <w:t>0.304 ± 0.011</w:t>
+            </w:r>
+          </w:p>
+        </w:tc>
+        <w:tc>
+          <w:tcPr>
+            <w:tcW w:type="dxa" w:w="1008"/>
             <w:shd w:val="clear" w:color="auto" w:fill="F2F7FF"/>
           </w:tcPr>
           <w:p>
@@ -5925,13 +7485,13 @@
                 <w:color w:val="595959"/>
                 <w:sz w:val="20"/>
               </w:rPr>
-              <w:t>0.717 ± 0.009</w:t>
-            </w:r>
-          </w:p>
-        </w:tc>
-        <w:tc>
-          <w:tcPr>
-            <w:tcW w:type="dxa" w:w="1296"/>
+              <w:t>−0.031</w:t>
+            </w:r>
+          </w:p>
+        </w:tc>
+        <w:tc>
+          <w:tcPr>
+            <w:tcW w:type="dxa" w:w="1440"/>
             <w:shd w:val="clear" w:color="auto" w:fill="F2F7FF"/>
           </w:tcPr>
           <w:p>
@@ -5940,134 +7500,7 @@
                 <w:color w:val="595959"/>
                 <w:sz w:val="20"/>
               </w:rPr>
-              <w:t>0.606 ± 0.008</w:t>
-            </w:r>
-          </w:p>
-        </w:tc>
-      </w:tr>
-    </w:tbl>
-    <w:p/>
-    <w:p>
-      <w:pPr>
-        <w:spacing w:before="160" w:after="40"/>
-      </w:pPr>
-      <w:r>
-        <w:rPr>
-          <w:b/>
-          <w:color w:val="1F497D"/>
-          <w:sz w:val="22"/>
-        </w:rPr>
-        <w:t>KIBA — Partial Results (Seeds 1–3 complete)</w:t>
-      </w:r>
-    </w:p>
-    <w:tbl>
-      <w:tblPr>
-        <w:tblStyle w:val="TableGrid"/>
-        <w:tblW w:type="auto" w:w="0"/>
-        <w:tblLook w:firstColumn="1" w:firstRow="1" w:lastColumn="0" w:lastRow="0" w:noHBand="0" w:noVBand="1" w:val="04A0"/>
-      </w:tblPr>
-      <w:tblGrid>
-        <w:gridCol w:w="1520"/>
-        <w:gridCol w:w="1520"/>
-        <w:gridCol w:w="1520"/>
-        <w:gridCol w:w="1520"/>
-        <w:gridCol w:w="1520"/>
-        <w:gridCol w:w="1520"/>
-      </w:tblGrid>
-      <w:tr>
-        <w:tc>
-          <w:tcPr>
-            <w:tcW w:type="dxa" w:w="2160"/>
-            <w:shd w:val="clear" w:color="auto" w:fill="1F497D"/>
-          </w:tcPr>
-          <w:p>
-            <w:r>
-              <w:rPr>
-                <w:b/>
-                <w:color w:val="FFFFFF"/>
-                <w:sz w:val="20"/>
-              </w:rPr>
-              <w:t>Seed</w:t>
-            </w:r>
-          </w:p>
-        </w:tc>
-        <w:tc>
-          <w:tcPr>
-            <w:tcW w:type="dxa" w:w="1296"/>
-            <w:shd w:val="clear" w:color="auto" w:fill="1F497D"/>
-          </w:tcPr>
-          <w:p>
-            <w:r>
-              <w:rPr>
-                <w:b/>
-                <w:color w:val="FFFFFF"/>
-                <w:sz w:val="20"/>
-              </w:rPr>
-              <w:t>MSE</w:t>
-            </w:r>
-          </w:p>
-        </w:tc>
-        <w:tc>
-          <w:tcPr>
-            <w:tcW w:type="dxa" w:w="1296"/>
-            <w:shd w:val="clear" w:color="auto" w:fill="1F497D"/>
-          </w:tcPr>
-          <w:p>
-            <w:r>
-              <w:rPr>
-                <w:b/>
-                <w:color w:val="FFFFFF"/>
-                <w:sz w:val="20"/>
-              </w:rPr>
-              <w:t>RMSE</w:t>
-            </w:r>
-          </w:p>
-        </w:tc>
-        <w:tc>
-          <w:tcPr>
-            <w:tcW w:type="dxa" w:w="1152"/>
-            <w:shd w:val="clear" w:color="auto" w:fill="1F497D"/>
-          </w:tcPr>
-          <w:p>
-            <w:r>
-              <w:rPr>
-                <w:b/>
-                <w:color w:val="FFFFFF"/>
-                <w:sz w:val="20"/>
-              </w:rPr>
-              <w:t>R²</w:t>
-            </w:r>
-          </w:p>
-        </w:tc>
-        <w:tc>
-          <w:tcPr>
-            <w:tcW w:type="dxa" w:w="1296"/>
-            <w:shd w:val="clear" w:color="auto" w:fill="1F497D"/>
-          </w:tcPr>
-          <w:p>
-            <w:r>
-              <w:rPr>
-                <w:b/>
-                <w:color w:val="FFFFFF"/>
-                <w:sz w:val="20"/>
-              </w:rPr>
-              <w:t>Pearson r</w:t>
-            </w:r>
-          </w:p>
-        </w:tc>
-        <w:tc>
-          <w:tcPr>
-            <w:tcW w:type="dxa" w:w="1296"/>
-            <w:shd w:val="clear" w:color="auto" w:fill="1F497D"/>
-          </w:tcPr>
-          <w:p>
-            <w:r>
-              <w:rPr>
-                <w:b/>
-                <w:color w:val="FFFFFF"/>
-                <w:sz w:val="20"/>
-              </w:rPr>
-              <w:t>Spearman ρ</w:t>
+              <w:t>0.009  ✓✓</w:t>
             </w:r>
           </w:p>
         </w:tc>
@@ -6075,91 +7508,91 @@
       <w:tr>
         <w:tc>
           <w:tcPr>
-            <w:tcW w:type="dxa" w:w="2160"/>
-            <w:shd w:val="clear" w:color="auto" w:fill="F2F7FF"/>
-          </w:tcPr>
-          <w:p>
-            <w:r>
-              <w:rPr>
-                <w:color w:val="595959"/>
-                <w:sz w:val="20"/>
-              </w:rPr>
-              <w:t>1</w:t>
-            </w:r>
-          </w:p>
-        </w:tc>
-        <w:tc>
-          <w:tcPr>
-            <w:tcW w:type="dxa" w:w="1296"/>
-            <w:shd w:val="clear" w:color="auto" w:fill="F2F7FF"/>
-          </w:tcPr>
-          <w:p>
-            <w:r>
-              <w:rPr>
-                <w:color w:val="595959"/>
-                <w:sz w:val="20"/>
-              </w:rPr>
-              <w:t>0.282</w:t>
-            </w:r>
-          </w:p>
-        </w:tc>
-        <w:tc>
-          <w:tcPr>
-            <w:tcW w:type="dxa" w:w="1296"/>
-            <w:shd w:val="clear" w:color="auto" w:fill="F2F7FF"/>
-          </w:tcPr>
-          <w:p>
-            <w:r>
-              <w:rPr>
-                <w:color w:val="595959"/>
-                <w:sz w:val="20"/>
-              </w:rPr>
-              <w:t>0.531</w:t>
-            </w:r>
-          </w:p>
-        </w:tc>
-        <w:tc>
-          <w:tcPr>
-            <w:tcW w:type="dxa" w:w="1152"/>
-            <w:shd w:val="clear" w:color="auto" w:fill="F2F7FF"/>
-          </w:tcPr>
-          <w:p>
-            <w:r>
-              <w:rPr>
-                <w:color w:val="595959"/>
-                <w:sz w:val="20"/>
-              </w:rPr>
-              <w:t>0.602</w:t>
-            </w:r>
-          </w:p>
-        </w:tc>
-        <w:tc>
-          <w:tcPr>
-            <w:tcW w:type="dxa" w:w="1296"/>
-            <w:shd w:val="clear" w:color="auto" w:fill="F2F7FF"/>
-          </w:tcPr>
-          <w:p>
-            <w:r>
-              <w:rPr>
-                <w:color w:val="595959"/>
-                <w:sz w:val="20"/>
-              </w:rPr>
-              <w:t>0.781</w:t>
-            </w:r>
-          </w:p>
-        </w:tc>
-        <w:tc>
-          <w:tcPr>
-            <w:tcW w:type="dxa" w:w="1296"/>
-            <w:shd w:val="clear" w:color="auto" w:fill="F2F7FF"/>
-          </w:tcPr>
-          <w:p>
-            <w:r>
-              <w:rPr>
-                <w:color w:val="595959"/>
-                <w:sz w:val="20"/>
-              </w:rPr>
-              <w:t>0.752</w:t>
+            <w:tcW w:type="dxa" w:w="1008"/>
+            <w:shd w:val="clear" w:color="auto" w:fill="FFFFFF"/>
+          </w:tcPr>
+          <w:p>
+            <w:r>
+              <w:rPr>
+                <w:color w:val="595959"/>
+                <w:sz w:val="20"/>
+              </w:rPr>
+              <w:t>KIBA</w:t>
+            </w:r>
+          </w:p>
+        </w:tc>
+        <w:tc>
+          <w:tcPr>
+            <w:tcW w:type="dxa" w:w="1440"/>
+            <w:shd w:val="clear" w:color="auto" w:fill="FFFFFF"/>
+          </w:tcPr>
+          <w:p>
+            <w:r>
+              <w:rPr>
+                <w:color w:val="595959"/>
+                <w:sz w:val="20"/>
+              </w:rPr>
+              <w:t>MAE ↓</w:t>
+            </w:r>
+          </w:p>
+        </w:tc>
+        <w:tc>
+          <w:tcPr>
+            <w:tcW w:type="dxa" w:w="1872"/>
+            <w:shd w:val="clear" w:color="auto" w:fill="FFFFFF"/>
+          </w:tcPr>
+          <w:p>
+            <w:r>
+              <w:rPr>
+                <w:color w:val="595959"/>
+                <w:sz w:val="20"/>
+              </w:rPr>
+              <w:t>0.354 ± 0.013</w:t>
+            </w:r>
+          </w:p>
+        </w:tc>
+        <w:tc>
+          <w:tcPr>
+            <w:tcW w:type="dxa" w:w="1872"/>
+            <w:shd w:val="clear" w:color="auto" w:fill="FFFFFF"/>
+          </w:tcPr>
+          <w:p>
+            <w:r>
+              <w:rPr>
+                <w:color w:val="595959"/>
+                <w:sz w:val="20"/>
+              </w:rPr>
+              <w:t>0.351 ± 0.008</w:t>
+            </w:r>
+          </w:p>
+        </w:tc>
+        <w:tc>
+          <w:tcPr>
+            <w:tcW w:type="dxa" w:w="1008"/>
+            <w:shd w:val="clear" w:color="auto" w:fill="FFFFFF"/>
+          </w:tcPr>
+          <w:p>
+            <w:r>
+              <w:rPr>
+                <w:color w:val="595959"/>
+                <w:sz w:val="20"/>
+              </w:rPr>
+              <w:t>+0.003</w:t>
+            </w:r>
+          </w:p>
+        </w:tc>
+        <w:tc>
+          <w:tcPr>
+            <w:tcW w:type="dxa" w:w="1440"/>
+            <w:shd w:val="clear" w:color="auto" w:fill="FFFFFF"/>
+          </w:tcPr>
+          <w:p>
+            <w:r>
+              <w:rPr>
+                <w:color w:val="595959"/>
+                <w:sz w:val="20"/>
+              </w:rPr>
+              <w:t>0.661  n.s.</w:t>
             </w:r>
           </w:p>
         </w:tc>
@@ -6167,91 +7600,91 @@
       <w:tr>
         <w:tc>
           <w:tcPr>
-            <w:tcW w:type="dxa" w:w="2160"/>
-            <w:shd w:val="clear" w:color="auto" w:fill="FFFFFF"/>
-          </w:tcPr>
-          <w:p>
-            <w:r>
-              <w:rPr>
-                <w:color w:val="595959"/>
-                <w:sz w:val="20"/>
-              </w:rPr>
-              <w:t>2</w:t>
-            </w:r>
-          </w:p>
-        </w:tc>
-        <w:tc>
-          <w:tcPr>
-            <w:tcW w:type="dxa" w:w="1296"/>
-            <w:shd w:val="clear" w:color="auto" w:fill="FFFFFF"/>
-          </w:tcPr>
-          <w:p>
-            <w:r>
-              <w:rPr>
-                <w:color w:val="595959"/>
-                <w:sz w:val="20"/>
-              </w:rPr>
-              <w:t>0.284</w:t>
-            </w:r>
-          </w:p>
-        </w:tc>
-        <w:tc>
-          <w:tcPr>
-            <w:tcW w:type="dxa" w:w="1296"/>
-            <w:shd w:val="clear" w:color="auto" w:fill="FFFFFF"/>
-          </w:tcPr>
-          <w:p>
-            <w:r>
-              <w:rPr>
-                <w:color w:val="595959"/>
-                <w:sz w:val="20"/>
-              </w:rPr>
-              <w:t>0.533</w:t>
-            </w:r>
-          </w:p>
-        </w:tc>
-        <w:tc>
-          <w:tcPr>
-            <w:tcW w:type="dxa" w:w="1152"/>
-            <w:shd w:val="clear" w:color="auto" w:fill="FFFFFF"/>
-          </w:tcPr>
-          <w:p>
-            <w:r>
-              <w:rPr>
-                <w:color w:val="595959"/>
-                <w:sz w:val="20"/>
-              </w:rPr>
-              <w:t>0.598</w:t>
-            </w:r>
-          </w:p>
-        </w:tc>
-        <w:tc>
-          <w:tcPr>
-            <w:tcW w:type="dxa" w:w="1296"/>
-            <w:shd w:val="clear" w:color="auto" w:fill="FFFFFF"/>
-          </w:tcPr>
-          <w:p>
-            <w:r>
-              <w:rPr>
-                <w:color w:val="595959"/>
-                <w:sz w:val="20"/>
-              </w:rPr>
-              <w:t>0.778</w:t>
-            </w:r>
-          </w:p>
-        </w:tc>
-        <w:tc>
-          <w:tcPr>
-            <w:tcW w:type="dxa" w:w="1296"/>
-            <w:shd w:val="clear" w:color="auto" w:fill="FFFFFF"/>
-          </w:tcPr>
-          <w:p>
-            <w:r>
-              <w:rPr>
-                <w:color w:val="595959"/>
-                <w:sz w:val="20"/>
-              </w:rPr>
-              <w:t>0.744</w:t>
+            <w:tcW w:type="dxa" w:w="1008"/>
+            <w:shd w:val="clear" w:color="auto" w:fill="F2F7FF"/>
+          </w:tcPr>
+          <w:p>
+            <w:r>
+              <w:rPr>
+                <w:color w:val="595959"/>
+                <w:sz w:val="20"/>
+              </w:rPr>
+              <w:t>KIBA</w:t>
+            </w:r>
+          </w:p>
+        </w:tc>
+        <w:tc>
+          <w:tcPr>
+            <w:tcW w:type="dxa" w:w="1440"/>
+            <w:shd w:val="clear" w:color="auto" w:fill="F2F7FF"/>
+          </w:tcPr>
+          <w:p>
+            <w:r>
+              <w:rPr>
+                <w:color w:val="595959"/>
+                <w:sz w:val="20"/>
+              </w:rPr>
+              <w:t>Pearson r ↑</w:t>
+            </w:r>
+          </w:p>
+        </w:tc>
+        <w:tc>
+          <w:tcPr>
+            <w:tcW w:type="dxa" w:w="1872"/>
+            <w:shd w:val="clear" w:color="auto" w:fill="F2F7FF"/>
+          </w:tcPr>
+          <w:p>
+            <w:r>
+              <w:rPr>
+                <w:color w:val="595959"/>
+                <w:sz w:val="20"/>
+              </w:rPr>
+              <w:t>0.787 ± 0.012</w:t>
+            </w:r>
+          </w:p>
+        </w:tc>
+        <w:tc>
+          <w:tcPr>
+            <w:tcW w:type="dxa" w:w="1872"/>
+            <w:shd w:val="clear" w:color="auto" w:fill="F2F7FF"/>
+          </w:tcPr>
+          <w:p>
+            <w:r>
+              <w:rPr>
+                <w:color w:val="595959"/>
+                <w:sz w:val="20"/>
+              </w:rPr>
+              <w:t>0.756 ± 0.010</w:t>
+            </w:r>
+          </w:p>
+        </w:tc>
+        <w:tc>
+          <w:tcPr>
+            <w:tcW w:type="dxa" w:w="1008"/>
+            <w:shd w:val="clear" w:color="auto" w:fill="F2F7FF"/>
+          </w:tcPr>
+          <w:p>
+            <w:r>
+              <w:rPr>
+                <w:color w:val="595959"/>
+                <w:sz w:val="20"/>
+              </w:rPr>
+              <w:t>+0.031</w:t>
+            </w:r>
+          </w:p>
+        </w:tc>
+        <w:tc>
+          <w:tcPr>
+            <w:tcW w:type="dxa" w:w="1440"/>
+            <w:shd w:val="clear" w:color="auto" w:fill="F2F7FF"/>
+          </w:tcPr>
+          <w:p>
+            <w:r>
+              <w:rPr>
+                <w:color w:val="595959"/>
+                <w:sz w:val="20"/>
+              </w:rPr>
+              <w:t>0.006  ✓✓</w:t>
             </w:r>
           </w:p>
         </w:tc>
@@ -6259,99 +7692,7 @@
       <w:tr>
         <w:tc>
           <w:tcPr>
-            <w:tcW w:type="dxa" w:w="2160"/>
-            <w:shd w:val="clear" w:color="auto" w:fill="F2F7FF"/>
-          </w:tcPr>
-          <w:p>
-            <w:r>
-              <w:rPr>
-                <w:color w:val="595959"/>
-                <w:sz w:val="20"/>
-              </w:rPr>
-              <w:t>3</w:t>
-            </w:r>
-          </w:p>
-        </w:tc>
-        <w:tc>
-          <w:tcPr>
-            <w:tcW w:type="dxa" w:w="1296"/>
-            <w:shd w:val="clear" w:color="auto" w:fill="F2F7FF"/>
-          </w:tcPr>
-          <w:p>
-            <w:r>
-              <w:rPr>
-                <w:color w:val="595959"/>
-                <w:sz w:val="20"/>
-              </w:rPr>
-              <w:t>0.284</w:t>
-            </w:r>
-          </w:p>
-        </w:tc>
-        <w:tc>
-          <w:tcPr>
-            <w:tcW w:type="dxa" w:w="1296"/>
-            <w:shd w:val="clear" w:color="auto" w:fill="F2F7FF"/>
-          </w:tcPr>
-          <w:p>
-            <w:r>
-              <w:rPr>
-                <w:color w:val="595959"/>
-                <w:sz w:val="20"/>
-              </w:rPr>
-              <w:t>0.533</w:t>
-            </w:r>
-          </w:p>
-        </w:tc>
-        <w:tc>
-          <w:tcPr>
-            <w:tcW w:type="dxa" w:w="1152"/>
-            <w:shd w:val="clear" w:color="auto" w:fill="F2F7FF"/>
-          </w:tcPr>
-          <w:p>
-            <w:r>
-              <w:rPr>
-                <w:color w:val="595959"/>
-                <w:sz w:val="20"/>
-              </w:rPr>
-              <w:t>0.598</w:t>
-            </w:r>
-          </w:p>
-        </w:tc>
-        <w:tc>
-          <w:tcPr>
-            <w:tcW w:type="dxa" w:w="1296"/>
-            <w:shd w:val="clear" w:color="auto" w:fill="F2F7FF"/>
-          </w:tcPr>
-          <w:p>
-            <w:r>
-              <w:rPr>
-                <w:color w:val="595959"/>
-                <w:sz w:val="20"/>
-              </w:rPr>
-              <w:t>0.778</w:t>
-            </w:r>
-          </w:p>
-        </w:tc>
-        <w:tc>
-          <w:tcPr>
-            <w:tcW w:type="dxa" w:w="1296"/>
-            <w:shd w:val="clear" w:color="auto" w:fill="F2F7FF"/>
-          </w:tcPr>
-          <w:p>
-            <w:r>
-              <w:rPr>
-                <w:color w:val="595959"/>
-                <w:sz w:val="20"/>
-              </w:rPr>
-              <w:t>0.748</w:t>
-            </w:r>
-          </w:p>
-        </w:tc>
-      </w:tr>
-      <w:tr>
-        <w:tc>
-          <w:tcPr>
-            <w:tcW w:type="dxa" w:w="2160"/>
+            <w:tcW w:type="dxa" w:w="1008"/>
             <w:shd w:val="clear" w:color="auto" w:fill="FFFFFF"/>
           </w:tcPr>
           <w:p>
@@ -6360,13 +7701,13 @@
                 <w:color w:val="595959"/>
                 <w:sz w:val="20"/>
               </w:rPr>
-              <w:t>Mean ± std (3 seeds)</w:t>
-            </w:r>
-          </w:p>
-        </w:tc>
-        <w:tc>
-          <w:tcPr>
-            <w:tcW w:type="dxa" w:w="1296"/>
+              <w:t>KIBA</w:t>
+            </w:r>
+          </w:p>
+        </w:tc>
+        <w:tc>
+          <w:tcPr>
+            <w:tcW w:type="dxa" w:w="1440"/>
             <w:shd w:val="clear" w:color="auto" w:fill="FFFFFF"/>
           </w:tcPr>
           <w:p>
@@ -6375,13 +7716,13 @@
                 <w:color w:val="595959"/>
                 <w:sz w:val="20"/>
               </w:rPr>
-              <w:t>0.283 ± 0.001</w:t>
-            </w:r>
-          </w:p>
-        </w:tc>
-        <w:tc>
-          <w:tcPr>
-            <w:tcW w:type="dxa" w:w="1296"/>
+              <w:t>R² ↑</w:t>
+            </w:r>
+          </w:p>
+        </w:tc>
+        <w:tc>
+          <w:tcPr>
+            <w:tcW w:type="dxa" w:w="1872"/>
             <w:shd w:val="clear" w:color="auto" w:fill="FFFFFF"/>
           </w:tcPr>
           <w:p>
@@ -6390,13 +7731,13 @@
                 <w:color w:val="595959"/>
                 <w:sz w:val="20"/>
               </w:rPr>
-              <w:t>0.532 ± 0.001</w:t>
-            </w:r>
-          </w:p>
-        </w:tc>
-        <w:tc>
-          <w:tcPr>
-            <w:tcW w:type="dxa" w:w="1152"/>
+              <w:t>0.613 ± 0.019</w:t>
+            </w:r>
+          </w:p>
+        </w:tc>
+        <w:tc>
+          <w:tcPr>
+            <w:tcW w:type="dxa" w:w="1872"/>
             <w:shd w:val="clear" w:color="auto" w:fill="FFFFFF"/>
           </w:tcPr>
           <w:p>
@@ -6405,13 +7746,13 @@
                 <w:color w:val="595959"/>
                 <w:sz w:val="20"/>
               </w:rPr>
-              <w:t>0.599 ± 0.002</w:t>
-            </w:r>
-          </w:p>
-        </w:tc>
-        <w:tc>
-          <w:tcPr>
-            <w:tcW w:type="dxa" w:w="1296"/>
+              <w:t>0.570 ± 0.015</w:t>
+            </w:r>
+          </w:p>
+        </w:tc>
+        <w:tc>
+          <w:tcPr>
+            <w:tcW w:type="dxa" w:w="1008"/>
             <w:shd w:val="clear" w:color="auto" w:fill="FFFFFF"/>
           </w:tcPr>
           <w:p>
@@ -6420,13 +7761,13 @@
                 <w:color w:val="595959"/>
                 <w:sz w:val="20"/>
               </w:rPr>
-              <w:t>0.779 ± 0.001</w:t>
-            </w:r>
-          </w:p>
-        </w:tc>
-        <w:tc>
-          <w:tcPr>
-            <w:tcW w:type="dxa" w:w="1296"/>
+              <w:t>+0.043</w:t>
+            </w:r>
+          </w:p>
+        </w:tc>
+        <w:tc>
+          <w:tcPr>
+            <w:tcW w:type="dxa" w:w="1440"/>
             <w:shd w:val="clear" w:color="auto" w:fill="FFFFFF"/>
           </w:tcPr>
           <w:p>
@@ -6435,7 +7776,7 @@
                 <w:color w:val="595959"/>
                 <w:sz w:val="20"/>
               </w:rPr>
-              <w:t>0.748 ± 0.003</w:t>
+              <w:t>0.009  ✓✓</w:t>
             </w:r>
           </w:p>
         </w:tc>
@@ -6447,7 +7788,7 @@
         <w:spacing w:before="120" w:after="120"/>
         <w:ind w:left="567"/>
         <w:pBdr>
-          <w:left w:val="single" w:sz="12" w:space="6" w:color="007078"/>
+          <w:left w:val="single" w:sz="12" w:space="6" w:color="19762E"/>
         </w:pBdr>
       </w:pPr>
       <w:r>
@@ -6456,7 +7797,7 @@
           <w:color w:val="595959"/>
           <w:sz w:val="21"/>
         </w:rPr>
-        <w:t>Note: Seed 5 for Davis and seeds 4–5 for KIBA are currently training. Final mean ± std values will be added once all runs complete. Early results suggest KIBA performance will be very stable (low std across seeds).</w:t>
+        <w:t>DTA conclusion:  Gated Cross-Attention is significantly better than concatenation on DTA regression for both datasets. Davis: all 6 metrics significant (5 at p&lt;0.01). KIBA: 4 of 6 metrics significant (p&lt;0.01); MAE and Spearman n.s. (models nearly tied on absolute/rank errors, but H-GNN handles high-affinity outliers better, as shown by the significantly lower MSE). The DTA advantage mirrors the DTI pattern.</w:t>
       </w:r>
     </w:p>
     <w:p>
@@ -6820,7 +8161,70 @@
           <w:color w:val="595959"/>
           <w:sz w:val="22"/>
         </w:rPr>
-        <w:t>DTA regression on Davis and KIBA — seeds 1–4 (Davis) and 1–3 (KIBA) complete; remaining seeds currently training.</w:t>
+        <w:t>MAE (Mean Absolute Error) added to DTA evaluation metrics — all 10 seed JSONs updated.</w:t>
+      </w:r>
+    </w:p>
+    <w:p>
+      <w:pPr>
+        <w:spacing w:before="20" w:after="20"/>
+        <w:ind w:left="454"/>
+      </w:pPr>
+      <w:r>
+        <w:rPr>
+          <w:b/>
+          <w:color w:val="19762E"/>
+          <w:sz w:val="22"/>
+        </w:rPr>
+        <w:t xml:space="preserve">✓  </w:t>
+      </w:r>
+      <w:r>
+        <w:rPr>
+          <w:color w:val="595959"/>
+          <w:sz w:val="22"/>
+        </w:rPr>
+        <w:t>DTA regression on Davis and KIBA — all 5 seeds complete for both datasets.</w:t>
+      </w:r>
+    </w:p>
+    <w:p>
+      <w:pPr>
+        <w:spacing w:before="20" w:after="20"/>
+        <w:ind w:left="454"/>
+      </w:pPr>
+      <w:r>
+        <w:rPr>
+          <w:b/>
+          <w:color w:val="19762E"/>
+          <w:sz w:val="22"/>
+        </w:rPr>
+        <w:t xml:space="preserve">✓  </w:t>
+      </w:r>
+      <w:r>
+        <w:rPr>
+          <w:color w:val="595959"/>
+          <w:sz w:val="22"/>
+        </w:rPr>
+        <w:t>DTA ConcatBaseline trained on Davis and KIBA — all 5 seeds complete for both datasets.</w:t>
+      </w:r>
+    </w:p>
+    <w:p>
+      <w:pPr>
+        <w:spacing w:before="20" w:after="20"/>
+        <w:ind w:left="454"/>
+      </w:pPr>
+      <w:r>
+        <w:rPr>
+          <w:b/>
+          <w:color w:val="19762E"/>
+          <w:sz w:val="22"/>
+        </w:rPr>
+        <w:t xml:space="preserve">✓  </w:t>
+      </w:r>
+      <w:r>
+        <w:rPr>
+          <w:color w:val="595959"/>
+          <w:sz w:val="22"/>
+        </w:rPr>
+        <w:t>Phase 5.4 DTA statistical testing — paired t-tests complete: H-GNN sig. better on 5/6 Davis metrics (p&lt;0.01) and 4/6 KIBA metrics (p&lt;0.01).</w:t>
       </w:r>
     </w:p>
     <w:p>
@@ -6932,48 +8336,6 @@
           <w:color w:val="595959"/>
           <w:sz w:val="22"/>
         </w:rPr>
-        <w:t>MAE (Mean Absolute Error) for DTA.  The plan lists both RMSE and MAE as regression metrics. The evaluation report currently reports MSE, RMSE, R², Pearson, and Spearman — but not MAE. This is a minor omission that can be added easily.</w:t>
-      </w:r>
-    </w:p>
-    <w:p>
-      <w:pPr>
-        <w:spacing w:before="20" w:after="20"/>
-        <w:ind w:left="454"/>
-      </w:pPr>
-      <w:r>
-        <w:rPr>
-          <w:b/>
-          <w:color w:val="C55A11"/>
-          <w:sz w:val="22"/>
-        </w:rPr>
-        <w:t xml:space="preserve">○  </w:t>
-      </w:r>
-      <w:r>
-        <w:rPr>
-          <w:color w:val="595959"/>
-          <w:sz w:val="22"/>
-        </w:rPr>
-        <w:t>Statistical significance testing for DTA.  Phase 5.4 requires t-tests for all model comparisons. For DTA, only one model variant was evaluated (H-GNN-RNN-DTI), so there is currently no baseline to compare against with a t-test. Adding a DTA concat baseline would enable this.</w:t>
-      </w:r>
-    </w:p>
-    <w:p>
-      <w:pPr>
-        <w:spacing w:before="20" w:after="20"/>
-        <w:ind w:left="454"/>
-      </w:pPr>
-      <w:r>
-        <w:rPr>
-          <w:b/>
-          <w:color w:val="C55A11"/>
-          <w:sz w:val="22"/>
-        </w:rPr>
-        <w:t xml:space="preserve">○  </w:t>
-      </w:r>
-      <w:r>
-        <w:rPr>
-          <w:color w:val="595959"/>
-          <w:sz w:val="22"/>
-        </w:rPr>
         <w:t>Yamanishi_08 other subsets (IC, GPCR, NR).  Only the Enzyme (E) subset was used in evaluation. The plan collected all four subsets, but only Enzyme is tested.</w:t>
       </w:r>
     </w:p>
@@ -7057,91 +8419,7 @@
           <w:color w:val="007078"/>
           <w:sz w:val="26"/>
         </w:rPr>
-        <w:t>Recommendation 1 — Add MAE to the DTA Evaluation</w:t>
-      </w:r>
-    </w:p>
-    <w:p>
-      <w:pPr>
-        <w:spacing w:before="40" w:after="80"/>
-      </w:pPr>
-      <w:r>
-        <w:rPr>
-          <w:color w:val="595959"/>
-          <w:sz w:val="22"/>
-        </w:rPr>
-        <w:t>This is the simplest fix. The plan specifies MAE as a DTA metric and it is commonly reported alongside RMSE in DTA papers (DeepDTA, GraphDTA). Adding it requires only one line of code in the evaluation function and makes the results directly comparable to published benchmarks.</w:t>
-      </w:r>
-    </w:p>
-    <w:p>
-      <w:pPr>
-        <w:spacing w:before="120" w:after="120"/>
-        <w:ind w:left="567"/>
-        <w:pBdr>
-          <w:left w:val="single" w:sz="12" w:space="6" w:color="007078"/>
-        </w:pBdr>
-      </w:pPr>
-      <w:r>
-        <w:rPr>
-          <w:i/>
-          <w:color w:val="595959"/>
-          <w:sz w:val="21"/>
-        </w:rPr>
-        <w:t>Effort: &lt; 1 hour. Impact: Low. Priority: High (completeness).</w:t>
-      </w:r>
-    </w:p>
-    <w:p>
-      <w:pPr>
-        <w:spacing w:before="240" w:after="40"/>
-      </w:pPr>
-      <w:r>
-        <w:rPr>
-          <w:b/>
-          <w:color w:val="007078"/>
-          <w:sz w:val="26"/>
-        </w:rPr>
-        <w:t>Recommendation 2 — Add a DTA Concat Baseline for Statistical Testing</w:t>
-      </w:r>
-    </w:p>
-    <w:p>
-      <w:pPr>
-        <w:spacing w:before="40" w:after="80"/>
-      </w:pPr>
-      <w:r>
-        <w:rPr>
-          <w:color w:val="595959"/>
-          <w:sz w:val="22"/>
-        </w:rPr>
-        <w:t>Currently, Section 3.5 (DTA) reports only one model — H-GNN-RNN-DTI — so there is nothing to compare against with a t-test. Training a DTA concat baseline on Davis and KIBA (5 seeds each) would complete the Phase 5.4 requirement and let us claim whether cross-attention also helps in the regression setting.</w:t>
-      </w:r>
-    </w:p>
-    <w:p>
-      <w:pPr>
-        <w:spacing w:before="120" w:after="120"/>
-        <w:ind w:left="567"/>
-        <w:pBdr>
-          <w:left w:val="single" w:sz="12" w:space="6" w:color="007078"/>
-        </w:pBdr>
-      </w:pPr>
-      <w:r>
-        <w:rPr>
-          <w:i/>
-          <w:color w:val="595959"/>
-          <w:sz w:val="21"/>
-        </w:rPr>
-        <w:t>Effort: ~2–4 hours training time (CPU). Impact: Medium. Priority: High.</w:t>
-      </w:r>
-    </w:p>
-    <w:p>
-      <w:pPr>
-        <w:spacing w:before="240" w:after="40"/>
-      </w:pPr>
-      <w:r>
-        <w:rPr>
-          <w:b/>
-          <w:color w:val="007078"/>
-          <w:sz w:val="26"/>
-        </w:rPr>
-        <w:t>Recommendation 3 — Address the luo_17 Cold-Target Anomaly</w:t>
+        <w:t>Recommendation 1 — Address the luo_17 Cold-Target Anomaly</w:t>
       </w:r>
     </w:p>
     <w:p>
@@ -7211,7 +8489,7 @@
           <w:color w:val="007078"/>
           <w:sz w:val="26"/>
         </w:rPr>
-        <w:t>Recommendation 4 — Add BindingDB as a Large-Scale Test</w:t>
+        <w:t>Recommendation 2 — Add BindingDB as a Large-Scale Test</w:t>
       </w:r>
     </w:p>
     <w:p>
@@ -7295,7 +8573,7 @@
           <w:color w:val="007078"/>
           <w:sz w:val="26"/>
         </w:rPr>
-        <w:t>Recommendation 5 — Evaluate the Other Yamanishi Subsets</w:t>
+        <w:t>Recommendation 3 — Evaluate the Other Yamanishi Subsets</w:t>
       </w:r>
     </w:p>
     <w:p>
@@ -7337,7 +8615,7 @@
           <w:color w:val="007078"/>
           <w:sz w:val="26"/>
         </w:rPr>
-        <w:t>Recommendation 6 — Add Attention Weight Visualisation (XAI)</w:t>
+        <w:t>Recommendation 4 — Add Attention Weight Visualisation (XAI)</w:t>
       </w:r>
     </w:p>
     <w:p>
@@ -7433,7 +8711,7 @@
           <w:color w:val="007078"/>
           <w:sz w:val="26"/>
         </w:rPr>
-        <w:t>Recommendation 7 — Use GPU for Faster Iteration</w:t>
+        <w:t>Recommendation 5 — Use GPU for Faster Iteration</w:t>
       </w:r>
     </w:p>
     <w:p>
@@ -7517,7 +8795,7 @@
           <w:color w:val="007078"/>
           <w:sz w:val="26"/>
         </w:rPr>
-        <w:t>Recommendation 8 — Pre-training on BindingDB Before Fine-Tuning</w:t>
+        <w:t>Recommendation 6 — Pre-training on BindingDB Before Fine-Tuning</w:t>
       </w:r>
     </w:p>
     <w:p>
@@ -7661,6 +8939,20 @@
     </w:p>
     <w:p>
       <w:pPr>
+        <w:pStyle w:val="ListBullet"/>
+        <w:spacing w:before="20" w:after="20"/>
+        <w:ind w:left="454"/>
+      </w:pPr>
+      <w:r>
+        <w:rPr>
+          <w:color w:val="595959"/>
+          <w:sz w:val="22"/>
+        </w:rPr>
+        <w:t>Cross-attention also significantly outperforms concatenation in the DTA regression setting (5/6 Davis metrics p&lt;0.01; 4/6 KIBA metrics p&lt;0.01), confirming the fusion advantage is consistent across both task types.</w:t>
+      </w:r>
+    </w:p>
+    <w:p>
+      <w:pPr>
         <w:spacing w:before="40" w:after="80"/>
       </w:pPr>
       <w:r>
@@ -7668,7 +8960,7 @@
           <w:color w:val="595959"/>
           <w:sz w:val="22"/>
         </w:rPr>
-        <w:t>The main remaining items are: completing the DTA seed runs, adding a DTA concat baseline for Phase 5.4 statistical testing, adding MAE as a metric, and — when GPU resources are available — evaluating on BindingDB and implementing attention visualisation.</w:t>
+        <w:t>All planned analysis for Objective 1 is now complete. The remaining open items are optional extensions: evaluating on BindingDB and the other Yamanishi subsets (both require GPU for practical training time), adding attention weight visualisation for interpretability, and investigating pre-training strategies to enable cross-dataset transfer.</w:t>
       </w:r>
     </w:p>
     <w:p>

</xml_diff>